<commit_message>
Do wrap up lesson (with quesionnaire improvements)
</commit_message>
<xml_diff>
--- a/CourseMaterial/07_wrapup/00_offboarding/exit_questionaire.docx
+++ b/CourseMaterial/07_wrapup/00_offboarding/exit_questionaire.docx
@@ -1,40 +1,24 @@
 
 <file path=word/document.xml><?xml version="1.0" encoding="utf-8"?>
-<w:document xmlns:wpc="http://schemas.microsoft.com/office/word/2010/wordprocessingCanvas" xmlns:cx="http://schemas.microsoft.com/office/drawing/2014/chartex" xmlns:cx1="http://schemas.microsoft.com/office/drawing/2015/9/8/chartex" xmlns:cx2="http://schemas.microsoft.com/office/drawing/2015/10/21/chartex" xmlns:cx3="http://schemas.microsoft.com/office/drawing/2016/5/9/chartex" xmlns:cx4="http://schemas.microsoft.com/office/drawing/2016/5/10/chartex" xmlns:cx5="http://schemas.microsoft.com/office/drawing/2016/5/11/chartex" xmlns:cx6="http://schemas.microsoft.com/office/drawing/2016/5/12/chartex" xmlns:cx7="http://schemas.microsoft.com/office/drawing/2016/5/13/chartex" xmlns:cx8="http://schemas.microsoft.com/office/drawing/2016/5/14/chartex" xmlns:mc="http://schemas.openxmlformats.org/markup-compatibility/2006" xmlns:aink="http://schemas.microsoft.com/office/drawing/2016/ink" xmlns:am3d="http://schemas.microsoft.com/office/drawing/2017/model3d" xmlns:o="urn:schemas-microsoft-com:office:office" xmlns:oel="http://schemas.microsoft.com/office/2019/extlst" xmlns:r="http://schemas.openxmlformats.org/officeDocument/2006/relationships" xmlns:m="http://schemas.openxmlformats.org/officeDocument/2006/math" xmlns:v="urn:schemas-microsoft-com:vml" xmlns:wp14="http://schemas.microsoft.com/office/word/2010/wordprocessingDrawing" xmlns:wp="http://schemas.openxmlformats.org/drawingml/2006/wordprocessingDrawing" xmlns:w10="urn:schemas-microsoft-com:office:word" xmlns:w="http://schemas.openxmlformats.org/wordprocessingml/2006/main" xmlns:w14="http://schemas.microsoft.com/office/word/2010/wordml" xmlns:w15="http://schemas.microsoft.com/office/word/2012/wordml" xmlns:w16cex="http://schemas.microsoft.com/office/word/2018/wordml/cex" xmlns:w16cid="http://schemas.microsoft.com/office/word/2016/wordml/cid" xmlns:w16="http://schemas.microsoft.com/office/word/2018/wordml" xmlns:w16sdtdh="http://schemas.microsoft.com/office/word/2020/wordml/sdtdatahash" xmlns:w16se="http://schemas.microsoft.com/office/word/2015/wordml/symex" xmlns:wpg="http://schemas.microsoft.com/office/word/2010/wordprocessingGroup" xmlns:wpi="http://schemas.microsoft.com/office/word/2010/wordprocessingInk" xmlns:wne="http://schemas.microsoft.com/office/word/2006/wordml" xmlns:wps="http://schemas.microsoft.com/office/word/2010/wordprocessingShape" mc:Ignorable="w14 w15 w16se w16cid w16 w16cex w16sdtdh wp14">
+<w:document xmlns:wpc="http://schemas.microsoft.com/office/word/2010/wordprocessingCanvas" xmlns:cx="http://schemas.microsoft.com/office/drawing/2014/chartex" xmlns:cx1="http://schemas.microsoft.com/office/drawing/2015/9/8/chartex" xmlns:cx2="http://schemas.microsoft.com/office/drawing/2015/10/21/chartex" xmlns:cx3="http://schemas.microsoft.com/office/drawing/2016/5/9/chartex" xmlns:cx4="http://schemas.microsoft.com/office/drawing/2016/5/10/chartex" xmlns:cx5="http://schemas.microsoft.com/office/drawing/2016/5/11/chartex" xmlns:cx6="http://schemas.microsoft.com/office/drawing/2016/5/12/chartex" xmlns:cx7="http://schemas.microsoft.com/office/drawing/2016/5/13/chartex" xmlns:cx8="http://schemas.microsoft.com/office/drawing/2016/5/14/chartex" xmlns:mc="http://schemas.openxmlformats.org/markup-compatibility/2006" xmlns:aink="http://schemas.microsoft.com/office/drawing/2016/ink" xmlns:am3d="http://schemas.microsoft.com/office/drawing/2017/model3d" xmlns:o="urn:schemas-microsoft-com:office:office" xmlns:oel="http://schemas.microsoft.com/office/2019/extlst" xmlns:r="http://schemas.openxmlformats.org/officeDocument/2006/relationships" xmlns:m="http://schemas.openxmlformats.org/officeDocument/2006/math" xmlns:v="urn:schemas-microsoft-com:vml" xmlns:wp14="http://schemas.microsoft.com/office/word/2010/wordprocessingDrawing" xmlns:wp="http://schemas.openxmlformats.org/drawingml/2006/wordprocessingDrawing" xmlns:w10="urn:schemas-microsoft-com:office:word" xmlns:w="http://schemas.openxmlformats.org/wordprocessingml/2006/main" xmlns:w14="http://schemas.microsoft.com/office/word/2010/wordml" xmlns:w15="http://schemas.microsoft.com/office/word/2012/wordml" xmlns:w16cex="http://schemas.microsoft.com/office/word/2018/wordml/cex" xmlns:w16cid="http://schemas.microsoft.com/office/word/2016/wordml/cid" xmlns:w16="http://schemas.microsoft.com/office/word/2018/wordml" xmlns:w16du="http://schemas.microsoft.com/office/word/2023/wordml/word16du" xmlns:w16sdtdh="http://schemas.microsoft.com/office/word/2020/wordml/sdtdatahash" xmlns:w16sdtfl="http://schemas.microsoft.com/office/word/2024/wordml/sdtformatlock" xmlns:w16se="http://schemas.microsoft.com/office/word/2015/wordml/symex" xmlns:wpg="http://schemas.microsoft.com/office/word/2010/wordprocessingGroup" xmlns:wpi="http://schemas.microsoft.com/office/word/2010/wordprocessingInk" xmlns:wne="http://schemas.microsoft.com/office/word/2006/wordml" xmlns:wps="http://schemas.microsoft.com/office/word/2010/wordprocessingShape" mc:Ignorable="w14 w15 w16se w16cid w16 w16cex w16sdtdh w16sdtfl w16du wp14">
   <w:body>
     <w:p>
       <w:pPr>
-        <w:pStyle w:val="Heading1"/>
-        <w:rPr>
-          <w:rFonts w:ascii="Garamond" w:hAnsi="Garamond"/>
+        <w:rPr>
+          <w:rFonts w:ascii="Garamond" w:hAnsi="Garamond"/>
+          <w:sz w:val="28"/>
+          <w:szCs w:val="28"/>
+        </w:rPr>
+      </w:pPr>
+      <w:r>
+        <w:rPr>
+          <w:rFonts w:ascii="Garamond" w:eastAsiaTheme="majorEastAsia" w:hAnsi="Garamond" w:cstheme="majorBidi"/>
           <w:b/>
           <w:bCs/>
-          <w:color w:val="auto"/>
           <w:sz w:val="28"/>
           <w:szCs w:val="28"/>
         </w:rPr>
-      </w:pPr>
-      <w:r>
-        <w:rPr>
-          <w:rFonts w:ascii="Garamond" w:hAnsi="Garamond"/>
-          <w:b/>
-          <w:bCs/>
-          <w:color w:val="auto"/>
-          <w:sz w:val="32"/>
-          <w:szCs w:val="32"/>
-        </w:rPr>
-        <w:t xml:space="preserve">It Was Nice to Meet You!                                    </w:t>
-      </w:r>
-      <w:r>
-        <w:rPr>
-          <w:rFonts w:ascii="Garamond" w:hAnsi="Garamond"/>
-          <w:b/>
-          <w:bCs/>
-          <w:color w:val="auto"/>
-          <w:sz w:val="28"/>
-          <w:szCs w:val="28"/>
-        </w:rPr>
-        <w:t>Name: _____________</w:t>
+        <w:t>It Was Nice to Meet You!                           Name: ________________</w:t>
       </w:r>
     </w:p>
     <w:p>
@@ -53,39 +37,437 @@
         </w:numPr>
         <w:rPr>
           <w:rFonts w:ascii="Garamond" w:hAnsi="Garamond"/>
-          <w:sz w:val="28"/>
-          <w:szCs w:val="28"/>
-        </w:rPr>
-      </w:pPr>
-      <w:r>
-        <w:rPr>
-          <w:rFonts w:ascii="Garamond" w:hAnsi="Garamond"/>
-          <w:sz w:val="28"/>
-          <w:szCs w:val="28"/>
+        </w:rPr>
+      </w:pPr>
+      <w:r>
+        <w:rPr>
+          <w:rFonts w:ascii="Garamond" w:hAnsi="Garamond"/>
+        </w:rPr>
+        <w:t>How has your opinion of Computer Science changed over the course of the year?</w:t>
+      </w:r>
+    </w:p>
+    <w:p>
+      <w:pPr>
+        <w:rPr>
+          <w:rFonts w:ascii="Garamond" w:hAnsi="Garamond"/>
+        </w:rPr>
+      </w:pPr>
+    </w:p>
+    <w:p>
+      <w:pPr>
+        <w:rPr>
+          <w:rFonts w:ascii="Garamond" w:hAnsi="Garamond"/>
+        </w:rPr>
+      </w:pPr>
+    </w:p>
+    <w:p>
+      <w:pPr>
+        <w:rPr>
+          <w:rFonts w:ascii="Garamond" w:hAnsi="Garamond"/>
+        </w:rPr>
+      </w:pPr>
+    </w:p>
+    <w:p>
+      <w:pPr>
+        <w:rPr>
+          <w:rFonts w:ascii="Garamond" w:hAnsi="Garamond"/>
+        </w:rPr>
+      </w:pPr>
+    </w:p>
+    <w:p>
+      <w:pPr>
+        <w:rPr>
+          <w:rFonts w:ascii="Garamond" w:hAnsi="Garamond"/>
+        </w:rPr>
+      </w:pPr>
+    </w:p>
+    <w:p>
+      <w:pPr>
+        <w:rPr>
+          <w:rFonts w:ascii="Garamond" w:hAnsi="Garamond"/>
+        </w:rPr>
+      </w:pPr>
+    </w:p>
+    <w:p>
+      <w:pPr>
+        <w:pStyle w:val="ListParagraph"/>
+        <w:numPr>
+          <w:ilvl w:val="0"/>
+          <w:numId w:val="1"/>
+        </w:numPr>
+        <w:rPr>
+          <w:rFonts w:ascii="Garamond" w:hAnsi="Garamond"/>
+        </w:rPr>
+      </w:pPr>
+      <w:r>
+        <w:rPr>
+          <w:rFonts w:ascii="Garamond" w:hAnsi="Garamond"/>
+        </w:rPr>
+        <w:t>What is something you understand better having taken this class?</w:t>
+      </w:r>
+    </w:p>
+    <w:p>
+      <w:pPr>
+        <w:rPr>
+          <w:rFonts w:ascii="Garamond" w:hAnsi="Garamond"/>
+        </w:rPr>
+      </w:pPr>
+    </w:p>
+    <w:p>
+      <w:pPr>
+        <w:rPr>
+          <w:rFonts w:ascii="Garamond" w:hAnsi="Garamond"/>
+        </w:rPr>
+      </w:pPr>
+    </w:p>
+    <w:p>
+      <w:pPr>
+        <w:rPr>
+          <w:rFonts w:ascii="Garamond" w:hAnsi="Garamond"/>
+        </w:rPr>
+      </w:pPr>
+    </w:p>
+    <w:p>
+      <w:pPr>
+        <w:rPr>
+          <w:rFonts w:ascii="Garamond" w:hAnsi="Garamond"/>
+        </w:rPr>
+      </w:pPr>
+    </w:p>
+    <w:p>
+      <w:pPr>
+        <w:rPr>
+          <w:rFonts w:ascii="Garamond" w:hAnsi="Garamond"/>
+        </w:rPr>
+      </w:pPr>
+    </w:p>
+    <w:p>
+      <w:pPr>
+        <w:rPr>
+          <w:rFonts w:ascii="Garamond" w:hAnsi="Garamond"/>
+        </w:rPr>
+      </w:pPr>
+    </w:p>
+    <w:p>
+      <w:pPr>
+        <w:pStyle w:val="ListParagraph"/>
+        <w:numPr>
+          <w:ilvl w:val="0"/>
+          <w:numId w:val="1"/>
+        </w:numPr>
+        <w:rPr>
+          <w:rFonts w:ascii="Garamond" w:hAnsi="Garamond"/>
+        </w:rPr>
+      </w:pPr>
+      <w:r>
+        <w:rPr>
+          <w:rFonts w:ascii="Garamond" w:hAnsi="Garamond"/>
+        </w:rPr>
+        <w:t>Rate how much each activity helped your learning</w:t>
+      </w:r>
+      <w:r>
+        <w:rPr>
+          <w:rFonts w:ascii="Garamond" w:hAnsi="Garamond"/>
+        </w:rPr>
+        <w:t xml:space="preserve"> </w:t>
+      </w:r>
+      <w:r>
+        <w:rPr>
+          <w:rFonts w:ascii="Garamond" w:hAnsi="Garamond"/>
+        </w:rPr>
+        <w:t>1 (strongly disagree) - 10 (strongly agree):</w:t>
+      </w:r>
+    </w:p>
+    <w:p>
+      <w:pPr>
+        <w:ind w:left="360"/>
+        <w:rPr>
+          <w:rFonts w:ascii="Garamond" w:hAnsi="Garamond"/>
+        </w:rPr>
+      </w:pPr>
+    </w:p>
+    <w:p>
+      <w:pPr>
+        <w:pStyle w:val="ListParagraph"/>
+        <w:numPr>
+          <w:ilvl w:val="1"/>
+          <w:numId w:val="1"/>
+        </w:numPr>
+        <w:rPr>
+          <w:rFonts w:ascii="Garamond" w:hAnsi="Garamond"/>
+        </w:rPr>
+      </w:pPr>
+      <w:r>
+        <w:rPr>
+          <w:rFonts w:ascii="Garamond" w:hAnsi="Garamond"/>
+        </w:rPr>
+        <w:t>Binary/Hex/ASCII activities: ___</w:t>
+      </w:r>
+    </w:p>
+    <w:p>
+      <w:pPr>
+        <w:pStyle w:val="ListParagraph"/>
+        <w:rPr>
+          <w:rFonts w:ascii="Garamond" w:hAnsi="Garamond"/>
+        </w:rPr>
+      </w:pPr>
+    </w:p>
+    <w:p>
+      <w:pPr>
+        <w:pStyle w:val="ListParagraph"/>
+        <w:numPr>
+          <w:ilvl w:val="1"/>
+          <w:numId w:val="1"/>
+        </w:numPr>
+        <w:rPr>
+          <w:rFonts w:ascii="Garamond" w:hAnsi="Garamond"/>
+        </w:rPr>
+      </w:pPr>
+      <w:r>
+        <w:rPr>
+          <w:rFonts w:ascii="Garamond" w:hAnsi="Garamond"/>
+        </w:rPr>
+        <w:t>Grok lessons: ___</w:t>
+      </w:r>
+    </w:p>
+    <w:p>
+      <w:pPr>
+        <w:rPr>
+          <w:rFonts w:ascii="Garamond" w:hAnsi="Garamond"/>
+        </w:rPr>
+      </w:pPr>
+    </w:p>
+    <w:p>
+      <w:pPr>
+        <w:pStyle w:val="ListParagraph"/>
+        <w:numPr>
+          <w:ilvl w:val="1"/>
+          <w:numId w:val="1"/>
+        </w:numPr>
+        <w:rPr>
+          <w:rFonts w:ascii="Garamond" w:hAnsi="Garamond"/>
+        </w:rPr>
+      </w:pPr>
+      <w:r>
+        <w:rPr>
+          <w:rFonts w:ascii="Garamond" w:hAnsi="Garamond"/>
+        </w:rPr>
+        <w:t>Mad Libs &amp; 20 Questions: ___</w:t>
+      </w:r>
+    </w:p>
+    <w:p>
+      <w:pPr>
+        <w:pStyle w:val="ListParagraph"/>
+        <w:rPr>
+          <w:rFonts w:ascii="Garamond" w:hAnsi="Garamond"/>
+        </w:rPr>
+      </w:pPr>
+    </w:p>
+    <w:p>
+      <w:pPr>
+        <w:pStyle w:val="ListParagraph"/>
+        <w:numPr>
+          <w:ilvl w:val="1"/>
+          <w:numId w:val="1"/>
+        </w:numPr>
+        <w:rPr>
+          <w:rFonts w:ascii="Garamond" w:hAnsi="Garamond"/>
+        </w:rPr>
+      </w:pPr>
+      <w:r>
+        <w:rPr>
+          <w:rFonts w:ascii="Garamond" w:hAnsi="Garamond"/>
+        </w:rPr>
+        <w:t xml:space="preserve">Functions &amp; </w:t>
+      </w:r>
+      <w:r>
+        <w:rPr>
+          <w:rFonts w:ascii="Garamond" w:hAnsi="Garamond"/>
+        </w:rPr>
+        <w:t>Fractals</w:t>
+      </w:r>
+      <w:r>
+        <w:rPr>
+          <w:rFonts w:ascii="Garamond" w:hAnsi="Garamond"/>
+        </w:rPr>
+        <w:t>: ___</w:t>
+      </w:r>
+    </w:p>
+    <w:p>
+      <w:pPr>
+        <w:rPr>
+          <w:rFonts w:ascii="Garamond" w:hAnsi="Garamond"/>
+        </w:rPr>
+      </w:pPr>
+    </w:p>
+    <w:p>
+      <w:pPr>
+        <w:pStyle w:val="ListParagraph"/>
+        <w:numPr>
+          <w:ilvl w:val="1"/>
+          <w:numId w:val="1"/>
+        </w:numPr>
+        <w:rPr>
+          <w:rFonts w:ascii="Garamond" w:hAnsi="Garamond"/>
+        </w:rPr>
+      </w:pPr>
+      <w:r>
+        <w:rPr>
+          <w:rFonts w:ascii="Garamond" w:hAnsi="Garamond"/>
+        </w:rPr>
+        <w:t>Fractals and Recursion</w:t>
+      </w:r>
+      <w:r>
+        <w:rPr>
+          <w:rFonts w:ascii="Garamond" w:hAnsi="Garamond"/>
+        </w:rPr>
+        <w:t xml:space="preserve">: </w:t>
+      </w:r>
+      <w:r>
+        <w:rPr>
+          <w:rFonts w:ascii="Garamond" w:hAnsi="Garamond"/>
+        </w:rPr>
+        <w:t>___</w:t>
+      </w:r>
+    </w:p>
+    <w:p>
+      <w:pPr>
+        <w:pStyle w:val="ListParagraph"/>
+        <w:rPr>
+          <w:rFonts w:ascii="Garamond" w:hAnsi="Garamond"/>
+        </w:rPr>
+      </w:pPr>
+    </w:p>
+    <w:p>
+      <w:pPr>
+        <w:pStyle w:val="ListParagraph"/>
+        <w:numPr>
+          <w:ilvl w:val="1"/>
+          <w:numId w:val="1"/>
+        </w:numPr>
+        <w:rPr>
+          <w:rFonts w:ascii="Garamond" w:hAnsi="Garamond"/>
+        </w:rPr>
+      </w:pPr>
+      <w:proofErr w:type="spellStart"/>
+      <w:r>
+        <w:rPr>
+          <w:rFonts w:ascii="Garamond" w:hAnsi="Garamond"/>
+        </w:rPr>
+        <w:t>Turbozzle</w:t>
+      </w:r>
+      <w:proofErr w:type="spellEnd"/>
+      <w:r>
+        <w:rPr>
+          <w:rFonts w:ascii="Garamond" w:hAnsi="Garamond"/>
+        </w:rPr>
+        <w:t>: ___</w:t>
+      </w:r>
+    </w:p>
+    <w:p>
+      <w:pPr>
+        <w:rPr>
+          <w:rFonts w:ascii="Garamond" w:hAnsi="Garamond"/>
+        </w:rPr>
+      </w:pPr>
+    </w:p>
+    <w:p>
+      <w:pPr>
+        <w:pStyle w:val="ListParagraph"/>
+        <w:numPr>
+          <w:ilvl w:val="1"/>
+          <w:numId w:val="1"/>
+        </w:numPr>
+        <w:rPr>
+          <w:rFonts w:ascii="Garamond" w:hAnsi="Garamond"/>
+        </w:rPr>
+      </w:pPr>
+      <w:r>
+        <w:rPr>
+          <w:rFonts w:ascii="Garamond" w:hAnsi="Garamond"/>
+        </w:rPr>
+        <w:t>Lists &amp; Prisoner's Dilemma: ___</w:t>
+      </w:r>
+    </w:p>
+    <w:p>
+      <w:pPr>
+        <w:rPr>
+          <w:rFonts w:ascii="Garamond" w:hAnsi="Garamond"/>
+        </w:rPr>
+      </w:pPr>
+    </w:p>
+    <w:p>
+      <w:pPr>
+        <w:pStyle w:val="ListParagraph"/>
+        <w:numPr>
+          <w:ilvl w:val="1"/>
+          <w:numId w:val="1"/>
+        </w:numPr>
+        <w:rPr>
+          <w:rFonts w:ascii="Garamond" w:hAnsi="Garamond"/>
+        </w:rPr>
+      </w:pPr>
+      <w:proofErr w:type="spellStart"/>
+      <w:r>
+        <w:rPr>
+          <w:rFonts w:ascii="Garamond" w:hAnsi="Garamond"/>
+        </w:rPr>
+        <w:t>PythoShop</w:t>
+      </w:r>
+      <w:proofErr w:type="spellEnd"/>
+      <w:r>
+        <w:rPr>
+          <w:rFonts w:ascii="Garamond" w:hAnsi="Garamond"/>
+        </w:rPr>
+        <w:t xml:space="preserve"> project: ___</w:t>
+      </w:r>
+    </w:p>
+    <w:p>
+      <w:pPr>
+        <w:rPr>
+          <w:rFonts w:ascii="Garamond" w:hAnsi="Garamond"/>
+        </w:rPr>
+      </w:pPr>
+    </w:p>
+    <w:p>
+      <w:pPr>
+        <w:rPr>
+          <w:rFonts w:ascii="Garamond" w:hAnsi="Garamond"/>
+        </w:rPr>
+      </w:pPr>
+    </w:p>
+    <w:p>
+      <w:pPr>
+        <w:pStyle w:val="ListParagraph"/>
+        <w:numPr>
+          <w:ilvl w:val="0"/>
+          <w:numId w:val="1"/>
+        </w:numPr>
+        <w:rPr>
+          <w:rFonts w:ascii="Garamond" w:hAnsi="Garamond"/>
+        </w:rPr>
+      </w:pPr>
+      <w:r>
+        <w:rPr>
+          <w:rFonts w:ascii="Garamond" w:hAnsi="Garamond"/>
         </w:rPr>
         <w:t>What was your favorite lesson or project</w:t>
       </w:r>
       <w:r>
         <w:rPr>
           <w:rFonts w:ascii="Garamond" w:hAnsi="Garamond"/>
-          <w:sz w:val="28"/>
-          <w:szCs w:val="28"/>
         </w:rPr>
         <w:t>? W</w:t>
       </w:r>
       <w:r>
         <w:rPr>
           <w:rFonts w:ascii="Garamond" w:hAnsi="Garamond"/>
-          <w:sz w:val="28"/>
-          <w:szCs w:val="28"/>
         </w:rPr>
         <w:t>hy</w:t>
       </w:r>
       <w:r>
         <w:rPr>
           <w:rFonts w:ascii="Garamond" w:hAnsi="Garamond"/>
-          <w:sz w:val="28"/>
-          <w:szCs w:val="28"/>
         </w:rPr>
         <w:t>?</w:t>
       </w:r>
@@ -94,44 +476,41 @@
       <w:pPr>
         <w:rPr>
           <w:rFonts w:ascii="Garamond" w:hAnsi="Garamond"/>
-          <w:sz w:val="28"/>
-          <w:szCs w:val="28"/>
-        </w:rPr>
-      </w:pPr>
-    </w:p>
-    <w:p>
-      <w:pPr>
-        <w:rPr>
-          <w:rFonts w:ascii="Garamond" w:hAnsi="Garamond"/>
-          <w:sz w:val="28"/>
-          <w:szCs w:val="28"/>
-        </w:rPr>
-      </w:pPr>
-    </w:p>
-    <w:p>
-      <w:pPr>
-        <w:rPr>
-          <w:rFonts w:ascii="Garamond" w:hAnsi="Garamond"/>
-          <w:sz w:val="28"/>
-          <w:szCs w:val="28"/>
-        </w:rPr>
-      </w:pPr>
-    </w:p>
-    <w:p>
-      <w:pPr>
-        <w:rPr>
-          <w:rFonts w:ascii="Garamond" w:hAnsi="Garamond"/>
-          <w:sz w:val="28"/>
-          <w:szCs w:val="28"/>
-        </w:rPr>
-      </w:pPr>
-    </w:p>
-    <w:p>
-      <w:pPr>
-        <w:rPr>
-          <w:rFonts w:ascii="Garamond" w:hAnsi="Garamond"/>
-          <w:sz w:val="28"/>
-          <w:szCs w:val="28"/>
+        </w:rPr>
+      </w:pPr>
+    </w:p>
+    <w:p>
+      <w:pPr>
+        <w:rPr>
+          <w:rFonts w:ascii="Garamond" w:hAnsi="Garamond"/>
+        </w:rPr>
+      </w:pPr>
+    </w:p>
+    <w:p>
+      <w:pPr>
+        <w:rPr>
+          <w:rFonts w:ascii="Garamond" w:hAnsi="Garamond"/>
+        </w:rPr>
+      </w:pPr>
+    </w:p>
+    <w:p>
+      <w:pPr>
+        <w:rPr>
+          <w:rFonts w:ascii="Garamond" w:hAnsi="Garamond"/>
+        </w:rPr>
+      </w:pPr>
+    </w:p>
+    <w:p>
+      <w:pPr>
+        <w:rPr>
+          <w:rFonts w:ascii="Garamond" w:hAnsi="Garamond"/>
+        </w:rPr>
+      </w:pPr>
+    </w:p>
+    <w:p>
+      <w:pPr>
+        <w:rPr>
+          <w:rFonts w:ascii="Garamond" w:hAnsi="Garamond"/>
         </w:rPr>
       </w:pPr>
     </w:p>
@@ -144,39 +523,29 @@
         </w:numPr>
         <w:rPr>
           <w:rFonts w:ascii="Garamond" w:hAnsi="Garamond"/>
-          <w:sz w:val="28"/>
-          <w:szCs w:val="28"/>
-        </w:rPr>
-      </w:pPr>
-      <w:r>
-        <w:rPr>
-          <w:rFonts w:ascii="Garamond" w:hAnsi="Garamond"/>
-          <w:sz w:val="28"/>
-          <w:szCs w:val="28"/>
+        </w:rPr>
+      </w:pPr>
+      <w:r>
+        <w:rPr>
+          <w:rFonts w:ascii="Garamond" w:hAnsi="Garamond"/>
         </w:rPr>
         <w:t>What was your least favorite lesson or project</w:t>
       </w:r>
       <w:r>
         <w:rPr>
           <w:rFonts w:ascii="Garamond" w:hAnsi="Garamond"/>
-          <w:sz w:val="28"/>
-          <w:szCs w:val="28"/>
         </w:rPr>
         <w:t>? W</w:t>
       </w:r>
       <w:r>
         <w:rPr>
           <w:rFonts w:ascii="Garamond" w:hAnsi="Garamond"/>
-          <w:sz w:val="28"/>
-          <w:szCs w:val="28"/>
         </w:rPr>
         <w:t>hy</w:t>
       </w:r>
       <w:r>
         <w:rPr>
           <w:rFonts w:ascii="Garamond" w:hAnsi="Garamond"/>
-          <w:sz w:val="28"/>
-          <w:szCs w:val="28"/>
         </w:rPr>
         <w:t>?</w:t>
       </w:r>
@@ -185,44 +554,27 @@
       <w:pPr>
         <w:rPr>
           <w:rFonts w:ascii="Garamond" w:hAnsi="Garamond"/>
-          <w:sz w:val="28"/>
-          <w:szCs w:val="28"/>
-        </w:rPr>
-      </w:pPr>
-    </w:p>
-    <w:p>
-      <w:pPr>
-        <w:rPr>
-          <w:rFonts w:ascii="Garamond" w:hAnsi="Garamond"/>
-          <w:sz w:val="28"/>
-          <w:szCs w:val="28"/>
-        </w:rPr>
-      </w:pPr>
-    </w:p>
-    <w:p>
-      <w:pPr>
-        <w:rPr>
-          <w:rFonts w:ascii="Garamond" w:hAnsi="Garamond"/>
-          <w:sz w:val="28"/>
-          <w:szCs w:val="28"/>
-        </w:rPr>
-      </w:pPr>
-    </w:p>
-    <w:p>
-      <w:pPr>
-        <w:rPr>
-          <w:rFonts w:ascii="Garamond" w:hAnsi="Garamond"/>
-          <w:sz w:val="28"/>
-          <w:szCs w:val="28"/>
-        </w:rPr>
-      </w:pPr>
-    </w:p>
-    <w:p>
-      <w:pPr>
-        <w:rPr>
-          <w:rFonts w:ascii="Garamond" w:hAnsi="Garamond"/>
-          <w:sz w:val="28"/>
-          <w:szCs w:val="28"/>
+        </w:rPr>
+      </w:pPr>
+    </w:p>
+    <w:p>
+      <w:pPr>
+        <w:rPr>
+          <w:rFonts w:ascii="Garamond" w:hAnsi="Garamond"/>
+        </w:rPr>
+      </w:pPr>
+    </w:p>
+    <w:p>
+      <w:pPr>
+        <w:rPr>
+          <w:rFonts w:ascii="Garamond" w:hAnsi="Garamond"/>
+        </w:rPr>
+      </w:pPr>
+    </w:p>
+    <w:p>
+      <w:pPr>
+        <w:rPr>
+          <w:rFonts w:ascii="Garamond" w:hAnsi="Garamond"/>
         </w:rPr>
       </w:pPr>
     </w:p>
@@ -235,61 +587,79 @@
         </w:numPr>
         <w:rPr>
           <w:rFonts w:ascii="Garamond" w:hAnsi="Garamond"/>
-          <w:sz w:val="28"/>
-          <w:szCs w:val="28"/>
-        </w:rPr>
-      </w:pPr>
-      <w:r>
-        <w:rPr>
-          <w:rFonts w:ascii="Garamond" w:hAnsi="Garamond"/>
-          <w:sz w:val="28"/>
-          <w:szCs w:val="28"/>
-        </w:rPr>
-        <w:t>What is something you understand better having taken this class?</w:t>
-      </w:r>
-    </w:p>
-    <w:p>
-      <w:pPr>
-        <w:rPr>
-          <w:rFonts w:ascii="Garamond" w:hAnsi="Garamond"/>
-          <w:sz w:val="28"/>
-          <w:szCs w:val="28"/>
-        </w:rPr>
-      </w:pPr>
-    </w:p>
-    <w:p>
-      <w:pPr>
-        <w:rPr>
-          <w:rFonts w:ascii="Garamond" w:hAnsi="Garamond"/>
-          <w:sz w:val="28"/>
-          <w:szCs w:val="28"/>
-        </w:rPr>
-      </w:pPr>
-    </w:p>
-    <w:p>
-      <w:pPr>
-        <w:rPr>
-          <w:rFonts w:ascii="Garamond" w:hAnsi="Garamond"/>
-          <w:sz w:val="28"/>
-          <w:szCs w:val="28"/>
-        </w:rPr>
-      </w:pPr>
-    </w:p>
-    <w:p>
-      <w:pPr>
-        <w:rPr>
-          <w:rFonts w:ascii="Garamond" w:hAnsi="Garamond"/>
-          <w:sz w:val="28"/>
-          <w:szCs w:val="28"/>
-        </w:rPr>
-      </w:pPr>
-    </w:p>
-    <w:p>
-      <w:pPr>
-        <w:rPr>
-          <w:rFonts w:ascii="Garamond" w:hAnsi="Garamond"/>
-          <w:sz w:val="28"/>
-          <w:szCs w:val="28"/>
+        </w:rPr>
+      </w:pPr>
+      <w:r>
+        <w:rPr>
+          <w:rFonts w:ascii="Garamond" w:hAnsi="Garamond"/>
+        </w:rPr>
+        <w:lastRenderedPageBreak/>
+        <w:t xml:space="preserve">What </w:t>
+      </w:r>
+      <w:r>
+        <w:rPr>
+          <w:rFonts w:ascii="Garamond" w:hAnsi="Garamond"/>
+        </w:rPr>
+        <w:t>is something you were</w:t>
+      </w:r>
+      <w:r>
+        <w:rPr>
+          <w:rFonts w:ascii="Garamond" w:hAnsi="Garamond"/>
+        </w:rPr>
+        <w:t xml:space="preserve"> disappointed we didn't do more of</w:t>
+      </w:r>
+      <w:r>
+        <w:rPr>
+          <w:rFonts w:ascii="Garamond" w:hAnsi="Garamond"/>
+        </w:rPr>
+        <w:t xml:space="preserve"> (or do at all)</w:t>
+      </w:r>
+      <w:r>
+        <w:rPr>
+          <w:rFonts w:ascii="Garamond" w:hAnsi="Garamond"/>
+        </w:rPr>
+        <w:t>?</w:t>
+      </w:r>
+    </w:p>
+    <w:p>
+      <w:pPr>
+        <w:rPr>
+          <w:rFonts w:ascii="Garamond" w:hAnsi="Garamond"/>
+        </w:rPr>
+      </w:pPr>
+    </w:p>
+    <w:p>
+      <w:pPr>
+        <w:rPr>
+          <w:rFonts w:ascii="Garamond" w:hAnsi="Garamond"/>
+        </w:rPr>
+      </w:pPr>
+    </w:p>
+    <w:p>
+      <w:pPr>
+        <w:rPr>
+          <w:rFonts w:ascii="Garamond" w:hAnsi="Garamond"/>
+        </w:rPr>
+      </w:pPr>
+    </w:p>
+    <w:p>
+      <w:pPr>
+        <w:rPr>
+          <w:rFonts w:ascii="Garamond" w:hAnsi="Garamond"/>
+        </w:rPr>
+      </w:pPr>
+    </w:p>
+    <w:p>
+      <w:pPr>
+        <w:rPr>
+          <w:rFonts w:ascii="Garamond" w:hAnsi="Garamond"/>
+        </w:rPr>
+      </w:pPr>
+    </w:p>
+    <w:p>
+      <w:pPr>
+        <w:rPr>
+          <w:rFonts w:ascii="Garamond" w:hAnsi="Garamond"/>
         </w:rPr>
       </w:pPr>
     </w:p>
@@ -302,93 +672,252 @@
         </w:numPr>
         <w:rPr>
           <w:rFonts w:ascii="Garamond" w:hAnsi="Garamond"/>
-          <w:sz w:val="28"/>
-          <w:szCs w:val="28"/>
-        </w:rPr>
-      </w:pPr>
-      <w:r>
-        <w:rPr>
-          <w:rFonts w:ascii="Garamond" w:hAnsi="Garamond"/>
-          <w:sz w:val="28"/>
-          <w:szCs w:val="28"/>
-        </w:rPr>
-        <w:t xml:space="preserve">What </w:t>
-      </w:r>
-      <w:r>
-        <w:rPr>
-          <w:rFonts w:ascii="Garamond" w:hAnsi="Garamond"/>
-          <w:sz w:val="28"/>
-          <w:szCs w:val="28"/>
-        </w:rPr>
-        <w:t>is something you were</w:t>
-      </w:r>
-      <w:r>
-        <w:rPr>
-          <w:rFonts w:ascii="Garamond" w:hAnsi="Garamond"/>
-          <w:sz w:val="28"/>
-          <w:szCs w:val="28"/>
-        </w:rPr>
-        <w:t xml:space="preserve"> disappointed we didn't do more of</w:t>
-      </w:r>
-      <w:r>
-        <w:rPr>
-          <w:rFonts w:ascii="Garamond" w:hAnsi="Garamond"/>
-          <w:sz w:val="28"/>
-          <w:szCs w:val="28"/>
-        </w:rPr>
-        <w:t xml:space="preserve"> (or do at all)</w:t>
-      </w:r>
-      <w:r>
-        <w:rPr>
-          <w:rFonts w:ascii="Garamond" w:hAnsi="Garamond"/>
-          <w:sz w:val="28"/>
-          <w:szCs w:val="28"/>
+        </w:rPr>
+      </w:pPr>
+      <w:r>
+        <w:rPr>
+          <w:rFonts w:ascii="Garamond" w:hAnsi="Garamond"/>
+        </w:rPr>
+        <w:t xml:space="preserve">If someone asks you </w:t>
+      </w:r>
+      <w:r>
+        <w:rPr>
+          <w:rFonts w:ascii="Garamond" w:hAnsi="Garamond"/>
+        </w:rPr>
+        <w:t>next year “</w:t>
+      </w:r>
+      <w:r>
+        <w:rPr>
+          <w:rFonts w:ascii="Garamond" w:hAnsi="Garamond"/>
+        </w:rPr>
+        <w:t>what did you learn in Computer</w:t>
+      </w:r>
+      <w:r>
+        <w:rPr>
+          <w:rFonts w:ascii="Garamond" w:hAnsi="Garamond"/>
+        </w:rPr>
+        <w:t xml:space="preserve"> Science</w:t>
+      </w:r>
+      <w:r>
+        <w:rPr>
+          <w:rFonts w:ascii="Garamond" w:hAnsi="Garamond"/>
+        </w:rPr>
+        <w:t>,</w:t>
+      </w:r>
+      <w:r>
+        <w:rPr>
+          <w:rFonts w:ascii="Garamond" w:hAnsi="Garamond"/>
+        </w:rPr>
+        <w:t xml:space="preserve">” </w:t>
+      </w:r>
+      <w:r>
+        <w:rPr>
+          <w:rFonts w:ascii="Garamond" w:hAnsi="Garamond"/>
+        </w:rPr>
+        <w:t>what will you say?</w:t>
+      </w:r>
+    </w:p>
+    <w:p>
+      <w:pPr>
+        <w:rPr>
+          <w:rFonts w:ascii="Garamond" w:hAnsi="Garamond"/>
+        </w:rPr>
+      </w:pPr>
+    </w:p>
+    <w:p>
+      <w:pPr>
+        <w:rPr>
+          <w:rFonts w:ascii="Garamond" w:hAnsi="Garamond"/>
+        </w:rPr>
+      </w:pPr>
+    </w:p>
+    <w:p>
+      <w:pPr>
+        <w:rPr>
+          <w:rFonts w:ascii="Garamond" w:hAnsi="Garamond"/>
+        </w:rPr>
+      </w:pPr>
+    </w:p>
+    <w:p>
+      <w:pPr>
+        <w:rPr>
+          <w:rFonts w:ascii="Garamond" w:hAnsi="Garamond"/>
+        </w:rPr>
+      </w:pPr>
+    </w:p>
+    <w:p>
+      <w:pPr>
+        <w:rPr>
+          <w:rFonts w:ascii="Garamond" w:hAnsi="Garamond"/>
+        </w:rPr>
+      </w:pPr>
+    </w:p>
+    <w:p>
+      <w:pPr>
+        <w:rPr>
+          <w:rFonts w:ascii="Garamond" w:hAnsi="Garamond"/>
+        </w:rPr>
+      </w:pPr>
+    </w:p>
+    <w:p>
+      <w:pPr>
+        <w:pStyle w:val="ListParagraph"/>
+        <w:numPr>
+          <w:ilvl w:val="0"/>
+          <w:numId w:val="1"/>
+        </w:numPr>
+        <w:rPr>
+          <w:rFonts w:ascii="Garamond" w:hAnsi="Garamond"/>
+        </w:rPr>
+      </w:pPr>
+      <w:r>
+        <w:rPr>
+          <w:rFonts w:ascii="Garamond" w:hAnsi="Garamond"/>
+        </w:rPr>
+        <w:t>How much time did you typically spend on CS outside of class</w:t>
+      </w:r>
+      <w:r>
+        <w:rPr>
+          <w:rFonts w:ascii="Garamond" w:hAnsi="Garamond"/>
         </w:rPr>
         <w:t>?</w:t>
       </w:r>
     </w:p>
     <w:p>
       <w:pPr>
-        <w:rPr>
-          <w:rFonts w:ascii="Garamond" w:hAnsi="Garamond"/>
-          <w:sz w:val="28"/>
-          <w:szCs w:val="28"/>
-        </w:rPr>
-      </w:pPr>
-    </w:p>
-    <w:p>
-      <w:pPr>
-        <w:rPr>
-          <w:rFonts w:ascii="Garamond" w:hAnsi="Garamond"/>
-          <w:sz w:val="28"/>
-          <w:szCs w:val="28"/>
-        </w:rPr>
-      </w:pPr>
-    </w:p>
-    <w:p>
-      <w:pPr>
-        <w:rPr>
-          <w:rFonts w:ascii="Garamond" w:hAnsi="Garamond"/>
-          <w:sz w:val="28"/>
-          <w:szCs w:val="28"/>
-        </w:rPr>
-      </w:pPr>
-    </w:p>
-    <w:p>
-      <w:pPr>
-        <w:rPr>
-          <w:rFonts w:ascii="Garamond" w:hAnsi="Garamond"/>
-          <w:sz w:val="28"/>
-          <w:szCs w:val="28"/>
-        </w:rPr>
-      </w:pPr>
-    </w:p>
-    <w:p>
-      <w:pPr>
-        <w:rPr>
-          <w:rFonts w:ascii="Garamond" w:hAnsi="Garamond"/>
-          <w:sz w:val="28"/>
-          <w:szCs w:val="28"/>
+        <w:ind w:left="360"/>
+        <w:rPr>
+          <w:rFonts w:ascii="Garamond" w:hAnsi="Garamond"/>
+        </w:rPr>
+      </w:pPr>
+    </w:p>
+    <w:p>
+      <w:pPr>
+        <w:pStyle w:val="ListParagraph"/>
+        <w:numPr>
+          <w:ilvl w:val="1"/>
+          <w:numId w:val="1"/>
+        </w:numPr>
+        <w:rPr>
+          <w:rFonts w:ascii="Garamond" w:hAnsi="Garamond"/>
+        </w:rPr>
+      </w:pPr>
+      <w:r>
+        <w:rPr>
+          <w:rFonts w:ascii="Garamond" w:hAnsi="Garamond"/>
+        </w:rPr>
+        <w:t xml:space="preserve">Homework: </w:t>
+      </w:r>
+      <w:r>
+        <w:rPr>
+          <w:rFonts w:ascii="Garamond" w:hAnsi="Garamond"/>
+        </w:rPr>
+        <w:t>___</w:t>
+      </w:r>
+      <w:r>
+        <w:rPr>
+          <w:rFonts w:ascii="Garamond" w:hAnsi="Garamond"/>
+        </w:rPr>
+        <w:t xml:space="preserve"> </w:t>
+      </w:r>
+      <w:r>
+        <w:rPr>
+          <w:rFonts w:ascii="Garamond" w:hAnsi="Garamond"/>
+        </w:rPr>
+        <w:t>hours / week</w:t>
+      </w:r>
+    </w:p>
+    <w:p>
+      <w:pPr>
+        <w:rPr>
+          <w:rFonts w:ascii="Garamond" w:hAnsi="Garamond"/>
+        </w:rPr>
+      </w:pPr>
+    </w:p>
+    <w:p>
+      <w:pPr>
+        <w:pStyle w:val="ListParagraph"/>
+        <w:numPr>
+          <w:ilvl w:val="1"/>
+          <w:numId w:val="1"/>
+        </w:numPr>
+        <w:rPr>
+          <w:rFonts w:ascii="Garamond" w:hAnsi="Garamond"/>
+        </w:rPr>
+      </w:pPr>
+      <w:r>
+        <w:rPr>
+          <w:rFonts w:ascii="Garamond" w:hAnsi="Garamond"/>
+        </w:rPr>
+        <w:t xml:space="preserve">Studying for tests: </w:t>
+      </w:r>
+      <w:r>
+        <w:rPr>
+          <w:rFonts w:ascii="Garamond" w:hAnsi="Garamond"/>
+        </w:rPr>
+        <w:t>___</w:t>
+      </w:r>
+      <w:r>
+        <w:rPr>
+          <w:rFonts w:ascii="Garamond" w:hAnsi="Garamond"/>
+        </w:rPr>
+        <w:t xml:space="preserve"> hours </w:t>
+      </w:r>
+      <w:r>
+        <w:rPr>
+          <w:rFonts w:ascii="Garamond" w:hAnsi="Garamond"/>
+        </w:rPr>
+        <w:t>/ test</w:t>
+      </w:r>
+    </w:p>
+    <w:p>
+      <w:pPr>
+        <w:rPr>
+          <w:rFonts w:ascii="Garamond" w:hAnsi="Garamond"/>
+        </w:rPr>
+      </w:pPr>
+    </w:p>
+    <w:p>
+      <w:pPr>
+        <w:pStyle w:val="ListParagraph"/>
+        <w:numPr>
+          <w:ilvl w:val="1"/>
+          <w:numId w:val="1"/>
+        </w:numPr>
+        <w:rPr>
+          <w:rFonts w:ascii="Garamond" w:hAnsi="Garamond"/>
+        </w:rPr>
+      </w:pPr>
+      <w:r>
+        <w:rPr>
+          <w:rFonts w:ascii="Garamond" w:hAnsi="Garamond"/>
+        </w:rPr>
+        <w:t xml:space="preserve">Misc work: </w:t>
+      </w:r>
+      <w:r>
+        <w:rPr>
+          <w:rFonts w:ascii="Garamond" w:hAnsi="Garamond"/>
+        </w:rPr>
+        <w:t>___</w:t>
+      </w:r>
+      <w:r>
+        <w:rPr>
+          <w:rFonts w:ascii="Garamond" w:hAnsi="Garamond"/>
+        </w:rPr>
+        <w:t xml:space="preserve"> hours /week</w:t>
+      </w:r>
+    </w:p>
+    <w:p>
+      <w:pPr>
+        <w:rPr>
+          <w:rFonts w:ascii="Garamond" w:hAnsi="Garamond"/>
+        </w:rPr>
+      </w:pPr>
+    </w:p>
+    <w:p>
+      <w:pPr>
+        <w:rPr>
+          <w:rFonts w:ascii="Garamond" w:hAnsi="Garamond"/>
         </w:rPr>
       </w:pPr>
     </w:p>
@@ -401,61 +930,66 @@
         </w:numPr>
         <w:rPr>
           <w:rFonts w:ascii="Garamond" w:hAnsi="Garamond"/>
-          <w:sz w:val="28"/>
-          <w:szCs w:val="28"/>
-        </w:rPr>
-      </w:pPr>
-      <w:r>
-        <w:rPr>
-          <w:rFonts w:ascii="Garamond" w:hAnsi="Garamond"/>
-          <w:sz w:val="28"/>
-          <w:szCs w:val="28"/>
-        </w:rPr>
-        <w:t>If someone asks you in a few weeks, what did you learn in Computer Science with Mr. Rizzi, what will you say?</w:t>
-      </w:r>
-    </w:p>
-    <w:p>
-      <w:pPr>
-        <w:rPr>
-          <w:rFonts w:ascii="Garamond" w:hAnsi="Garamond"/>
-          <w:sz w:val="28"/>
-          <w:szCs w:val="28"/>
-        </w:rPr>
-      </w:pPr>
-    </w:p>
-    <w:p>
-      <w:pPr>
-        <w:rPr>
-          <w:rFonts w:ascii="Garamond" w:hAnsi="Garamond"/>
-          <w:sz w:val="28"/>
-          <w:szCs w:val="28"/>
-        </w:rPr>
-      </w:pPr>
-    </w:p>
-    <w:p>
-      <w:pPr>
-        <w:rPr>
-          <w:rFonts w:ascii="Garamond" w:hAnsi="Garamond"/>
-          <w:sz w:val="28"/>
-          <w:szCs w:val="28"/>
-        </w:rPr>
-      </w:pPr>
-    </w:p>
-    <w:p>
-      <w:pPr>
-        <w:rPr>
-          <w:rFonts w:ascii="Garamond" w:hAnsi="Garamond"/>
-          <w:sz w:val="28"/>
-          <w:szCs w:val="28"/>
-        </w:rPr>
-      </w:pPr>
-    </w:p>
-    <w:p>
-      <w:pPr>
-        <w:rPr>
-          <w:rFonts w:ascii="Garamond" w:hAnsi="Garamond"/>
-          <w:sz w:val="28"/>
-          <w:szCs w:val="28"/>
+        </w:rPr>
+      </w:pPr>
+      <w:r>
+        <w:rPr>
+          <w:rFonts w:ascii="Garamond" w:hAnsi="Garamond"/>
+        </w:rPr>
+        <w:t xml:space="preserve">How does the workload </w:t>
+      </w:r>
+      <w:r>
+        <w:rPr>
+          <w:rFonts w:ascii="Garamond" w:hAnsi="Garamond"/>
+        </w:rPr>
+        <w:t xml:space="preserve">for this class </w:t>
+      </w:r>
+      <w:r>
+        <w:rPr>
+          <w:rFonts w:ascii="Garamond" w:hAnsi="Garamond"/>
+        </w:rPr>
+        <w:t>compare to other classes?</w:t>
+      </w:r>
+    </w:p>
+    <w:p>
+      <w:pPr>
+        <w:rPr>
+          <w:rFonts w:ascii="Garamond" w:hAnsi="Garamond"/>
+        </w:rPr>
+      </w:pPr>
+    </w:p>
+    <w:p>
+      <w:pPr>
+        <w:rPr>
+          <w:rFonts w:ascii="Garamond" w:hAnsi="Garamond"/>
+        </w:rPr>
+      </w:pPr>
+    </w:p>
+    <w:p>
+      <w:pPr>
+        <w:rPr>
+          <w:rFonts w:ascii="Garamond" w:hAnsi="Garamond"/>
+        </w:rPr>
+      </w:pPr>
+    </w:p>
+    <w:p>
+      <w:pPr>
+        <w:rPr>
+          <w:rFonts w:ascii="Garamond" w:hAnsi="Garamond"/>
+        </w:rPr>
+      </w:pPr>
+    </w:p>
+    <w:p>
+      <w:pPr>
+        <w:rPr>
+          <w:rFonts w:ascii="Garamond" w:hAnsi="Garamond"/>
+        </w:rPr>
+      </w:pPr>
+    </w:p>
+    <w:p>
+      <w:pPr>
+        <w:rPr>
+          <w:rFonts w:ascii="Garamond" w:hAnsi="Garamond"/>
         </w:rPr>
       </w:pPr>
     </w:p>
@@ -468,56 +1002,276 @@
         </w:numPr>
         <w:rPr>
           <w:rFonts w:ascii="Garamond" w:hAnsi="Garamond"/>
-          <w:sz w:val="28"/>
-          <w:szCs w:val="28"/>
-        </w:rPr>
-      </w:pPr>
-      <w:r>
-        <w:rPr>
-          <w:rFonts w:ascii="Garamond" w:hAnsi="Garamond"/>
-          <w:sz w:val="28"/>
-          <w:szCs w:val="28"/>
-        </w:rPr>
-        <w:t>How has your opinion of Computer Science changed over the course of the year?</w:t>
-      </w:r>
-    </w:p>
-    <w:p>
-      <w:pPr>
-        <w:pStyle w:val="ListParagraph"/>
-        <w:rPr>
-          <w:rFonts w:ascii="Garamond" w:hAnsi="Garamond"/>
-          <w:sz w:val="28"/>
-          <w:szCs w:val="28"/>
-        </w:rPr>
-      </w:pPr>
-    </w:p>
-    <w:p>
-      <w:pPr>
-        <w:pStyle w:val="ListParagraph"/>
-        <w:rPr>
-          <w:rFonts w:ascii="Garamond" w:hAnsi="Garamond"/>
-          <w:sz w:val="28"/>
-          <w:szCs w:val="28"/>
-        </w:rPr>
-      </w:pPr>
-    </w:p>
-    <w:p>
-      <w:pPr>
-        <w:pStyle w:val="ListParagraph"/>
-        <w:rPr>
-          <w:rFonts w:ascii="Garamond" w:hAnsi="Garamond"/>
-          <w:sz w:val="28"/>
-          <w:szCs w:val="28"/>
-        </w:rPr>
-      </w:pPr>
-    </w:p>
-    <w:p>
-      <w:pPr>
-        <w:pStyle w:val="ListParagraph"/>
-        <w:rPr>
-          <w:rFonts w:ascii="Garamond" w:hAnsi="Garamond"/>
-          <w:sz w:val="28"/>
-          <w:szCs w:val="28"/>
+        </w:rPr>
+      </w:pPr>
+      <w:r>
+        <w:rPr>
+          <w:rFonts w:ascii="Garamond" w:hAnsi="Garamond"/>
+        </w:rPr>
+        <w:t>Rate the following statements on a scale of 1 (strongly disagree) - 10 (strongly agree):</w:t>
+      </w:r>
+    </w:p>
+    <w:p>
+      <w:pPr>
+        <w:ind w:left="360"/>
+        <w:rPr>
+          <w:rFonts w:ascii="Garamond" w:hAnsi="Garamond"/>
+        </w:rPr>
+      </w:pPr>
+    </w:p>
+    <w:p>
+      <w:pPr>
+        <w:pStyle w:val="ListParagraph"/>
+        <w:numPr>
+          <w:ilvl w:val="1"/>
+          <w:numId w:val="1"/>
+        </w:numPr>
+        <w:rPr>
+          <w:rFonts w:ascii="Garamond" w:hAnsi="Garamond"/>
+        </w:rPr>
+      </w:pPr>
+      <w:r>
+        <w:rPr>
+          <w:rFonts w:ascii="Garamond" w:hAnsi="Garamond"/>
+        </w:rPr>
+        <w:t>My teacher was prepared for class: ___</w:t>
+      </w:r>
+    </w:p>
+    <w:p>
+      <w:pPr>
+        <w:pStyle w:val="ListParagraph"/>
+        <w:rPr>
+          <w:rFonts w:ascii="Garamond" w:hAnsi="Garamond"/>
+        </w:rPr>
+      </w:pPr>
+    </w:p>
+    <w:p>
+      <w:pPr>
+        <w:pStyle w:val="ListParagraph"/>
+        <w:numPr>
+          <w:ilvl w:val="1"/>
+          <w:numId w:val="1"/>
+        </w:numPr>
+        <w:rPr>
+          <w:rFonts w:ascii="Garamond" w:hAnsi="Garamond"/>
+        </w:rPr>
+      </w:pPr>
+      <w:r>
+        <w:rPr>
+          <w:rFonts w:ascii="Garamond" w:hAnsi="Garamond"/>
+        </w:rPr>
+        <w:t xml:space="preserve">The </w:t>
+      </w:r>
+      <w:r>
+        <w:rPr>
+          <w:rFonts w:ascii="Garamond" w:hAnsi="Garamond"/>
+        </w:rPr>
+        <w:t>in-class activities and worksheets</w:t>
+      </w:r>
+      <w:r>
+        <w:rPr>
+          <w:rFonts w:ascii="Garamond" w:hAnsi="Garamond"/>
+        </w:rPr>
+        <w:t xml:space="preserve"> helped me understand the material: ___</w:t>
+      </w:r>
+    </w:p>
+    <w:p>
+      <w:pPr>
+        <w:rPr>
+          <w:rFonts w:ascii="Garamond" w:hAnsi="Garamond"/>
+        </w:rPr>
+      </w:pPr>
+    </w:p>
+    <w:p>
+      <w:pPr>
+        <w:pStyle w:val="ListParagraph"/>
+        <w:numPr>
+          <w:ilvl w:val="1"/>
+          <w:numId w:val="1"/>
+        </w:numPr>
+        <w:rPr>
+          <w:rFonts w:ascii="Garamond" w:hAnsi="Garamond"/>
+        </w:rPr>
+      </w:pPr>
+      <w:r>
+        <w:rPr>
+          <w:rFonts w:ascii="Garamond" w:hAnsi="Garamond"/>
+        </w:rPr>
+        <w:t xml:space="preserve">The </w:t>
+      </w:r>
+      <w:r>
+        <w:rPr>
+          <w:rFonts w:ascii="Garamond" w:hAnsi="Garamond"/>
+        </w:rPr>
+        <w:t>in-class activities</w:t>
+      </w:r>
+      <w:r>
+        <w:rPr>
+          <w:rFonts w:ascii="Garamond" w:hAnsi="Garamond"/>
+        </w:rPr>
+        <w:t xml:space="preserve"> </w:t>
+      </w:r>
+      <w:r>
+        <w:rPr>
+          <w:rFonts w:ascii="Garamond" w:hAnsi="Garamond"/>
+        </w:rPr>
+        <w:t>and worksheets</w:t>
+      </w:r>
+      <w:r>
+        <w:rPr>
+          <w:rFonts w:ascii="Garamond" w:hAnsi="Garamond"/>
+        </w:rPr>
+        <w:t xml:space="preserve"> </w:t>
+      </w:r>
+      <w:r>
+        <w:rPr>
+          <w:rFonts w:ascii="Garamond" w:hAnsi="Garamond"/>
+        </w:rPr>
+        <w:t>were</w:t>
+      </w:r>
+      <w:r>
+        <w:rPr>
+          <w:rFonts w:ascii="Garamond" w:hAnsi="Garamond"/>
+        </w:rPr>
+        <w:t xml:space="preserve"> engaging and interesting: ___</w:t>
+      </w:r>
+    </w:p>
+    <w:p>
+      <w:pPr>
+        <w:rPr>
+          <w:rFonts w:ascii="Garamond" w:hAnsi="Garamond"/>
+        </w:rPr>
+      </w:pPr>
+    </w:p>
+    <w:p>
+      <w:pPr>
+        <w:pStyle w:val="ListParagraph"/>
+        <w:numPr>
+          <w:ilvl w:val="1"/>
+          <w:numId w:val="1"/>
+        </w:numPr>
+        <w:rPr>
+          <w:rFonts w:ascii="Garamond" w:hAnsi="Garamond"/>
+        </w:rPr>
+      </w:pPr>
+      <w:r>
+        <w:rPr>
+          <w:rFonts w:ascii="Garamond" w:hAnsi="Garamond"/>
+        </w:rPr>
+        <w:t>The homework helped me understand the material: ___</w:t>
+      </w:r>
+    </w:p>
+    <w:p>
+      <w:pPr>
+        <w:pStyle w:val="ListParagraph"/>
+        <w:rPr>
+          <w:rFonts w:ascii="Garamond" w:hAnsi="Garamond"/>
+        </w:rPr>
+      </w:pPr>
+    </w:p>
+    <w:p>
+      <w:pPr>
+        <w:pStyle w:val="ListParagraph"/>
+        <w:numPr>
+          <w:ilvl w:val="1"/>
+          <w:numId w:val="1"/>
+        </w:numPr>
+        <w:rPr>
+          <w:rFonts w:ascii="Garamond" w:hAnsi="Garamond"/>
+        </w:rPr>
+      </w:pPr>
+      <w:r>
+        <w:rPr>
+          <w:rFonts w:ascii="Garamond" w:hAnsi="Garamond"/>
+        </w:rPr>
+        <w:t>The teacher provided helpful feedback on my work: ___</w:t>
+      </w:r>
+    </w:p>
+    <w:p>
+      <w:pPr>
+        <w:rPr>
+          <w:rFonts w:ascii="Garamond" w:hAnsi="Garamond"/>
+        </w:rPr>
+      </w:pPr>
+    </w:p>
+    <w:p>
+      <w:pPr>
+        <w:pStyle w:val="ListParagraph"/>
+        <w:numPr>
+          <w:ilvl w:val="1"/>
+          <w:numId w:val="1"/>
+        </w:numPr>
+        <w:rPr>
+          <w:rFonts w:ascii="Garamond" w:hAnsi="Garamond"/>
+        </w:rPr>
+      </w:pPr>
+      <w:r>
+        <w:rPr>
+          <w:rFonts w:ascii="Garamond" w:hAnsi="Garamond"/>
+        </w:rPr>
+        <w:t>The tests and assessments accurately captured my understanding</w:t>
+      </w:r>
+      <w:r>
+        <w:rPr>
+          <w:rFonts w:ascii="Garamond" w:hAnsi="Garamond"/>
+        </w:rPr>
+        <w:t>: ___</w:t>
+      </w:r>
+    </w:p>
+    <w:p>
+      <w:pPr>
+        <w:rPr>
+          <w:rFonts w:ascii="Garamond" w:hAnsi="Garamond"/>
+        </w:rPr>
+      </w:pPr>
+    </w:p>
+    <w:p>
+      <w:pPr>
+        <w:pStyle w:val="ListParagraph"/>
+        <w:numPr>
+          <w:ilvl w:val="1"/>
+          <w:numId w:val="1"/>
+        </w:numPr>
+        <w:rPr>
+          <w:rFonts w:ascii="Garamond" w:hAnsi="Garamond"/>
+        </w:rPr>
+      </w:pPr>
+      <w:r>
+        <w:rPr>
+          <w:rFonts w:ascii="Garamond" w:hAnsi="Garamond"/>
+        </w:rPr>
+        <w:t>There was a good mixture of working individually and in groups: ___</w:t>
+      </w:r>
+    </w:p>
+    <w:p>
+      <w:pPr>
+        <w:rPr>
+          <w:rFonts w:ascii="Garamond" w:hAnsi="Garamond"/>
+        </w:rPr>
+      </w:pPr>
+    </w:p>
+    <w:p>
+      <w:pPr>
+        <w:pStyle w:val="ListParagraph"/>
+        <w:numPr>
+          <w:ilvl w:val="1"/>
+          <w:numId w:val="1"/>
+        </w:numPr>
+        <w:rPr>
+          <w:rFonts w:ascii="Garamond" w:hAnsi="Garamond"/>
+        </w:rPr>
+      </w:pPr>
+      <w:r>
+        <w:rPr>
+          <w:rFonts w:ascii="Garamond" w:hAnsi="Garamond"/>
+        </w:rPr>
+        <w:t>The pace of the class was appropriate (not too fast or too slow): ___</w:t>
+      </w:r>
+    </w:p>
+    <w:p>
+      <w:pPr>
+        <w:rPr>
+          <w:rFonts w:ascii="Garamond" w:hAnsi="Garamond"/>
         </w:rPr>
       </w:pPr>
     </w:p>
@@ -530,102 +1284,61 @@
         </w:numPr>
         <w:rPr>
           <w:rFonts w:ascii="Garamond" w:hAnsi="Garamond"/>
-          <w:sz w:val="28"/>
-          <w:szCs w:val="28"/>
-        </w:rPr>
-      </w:pPr>
-      <w:r>
-        <w:rPr>
-          <w:rFonts w:ascii="Garamond" w:hAnsi="Garamond"/>
-          <w:sz w:val="28"/>
-          <w:szCs w:val="28"/>
+        </w:rPr>
+      </w:pPr>
+      <w:r>
+        <w:rPr>
+          <w:rFonts w:ascii="Garamond" w:hAnsi="Garamond"/>
         </w:rPr>
         <w:lastRenderedPageBreak/>
-        <w:t>On average, h</w:t>
-      </w:r>
-      <w:r>
-        <w:rPr>
-          <w:rFonts w:ascii="Garamond" w:hAnsi="Garamond"/>
-          <w:sz w:val="28"/>
-          <w:szCs w:val="28"/>
-        </w:rPr>
-        <w:t>ow much time outside the class</w:t>
-      </w:r>
-      <w:r>
-        <w:rPr>
-          <w:rFonts w:ascii="Garamond" w:hAnsi="Garamond"/>
-          <w:sz w:val="28"/>
-          <w:szCs w:val="28"/>
-        </w:rPr>
-        <w:t xml:space="preserve"> </w:t>
-      </w:r>
-      <w:r>
-        <w:rPr>
-          <w:rFonts w:ascii="Garamond" w:hAnsi="Garamond"/>
-          <w:sz w:val="28"/>
-          <w:szCs w:val="28"/>
-        </w:rPr>
-        <w:t>do you think you spent</w:t>
-      </w:r>
-      <w:r>
-        <w:rPr>
-          <w:rFonts w:ascii="Garamond" w:hAnsi="Garamond"/>
-          <w:sz w:val="28"/>
-          <w:szCs w:val="28"/>
-        </w:rPr>
-        <w:t xml:space="preserve"> on CS-related work</w:t>
-      </w:r>
-      <w:r>
-        <w:rPr>
-          <w:rFonts w:ascii="Garamond" w:hAnsi="Garamond"/>
-          <w:sz w:val="28"/>
-          <w:szCs w:val="28"/>
-        </w:rPr>
-        <w:t>?</w:t>
-      </w:r>
-    </w:p>
-    <w:p>
-      <w:pPr>
-        <w:rPr>
-          <w:rFonts w:ascii="Garamond" w:hAnsi="Garamond"/>
-          <w:sz w:val="28"/>
-          <w:szCs w:val="28"/>
-        </w:rPr>
-      </w:pPr>
-    </w:p>
-    <w:p>
-      <w:pPr>
-        <w:rPr>
-          <w:rFonts w:ascii="Garamond" w:hAnsi="Garamond"/>
-          <w:sz w:val="28"/>
-          <w:szCs w:val="28"/>
-        </w:rPr>
-      </w:pPr>
-    </w:p>
-    <w:p>
-      <w:pPr>
-        <w:rPr>
-          <w:rFonts w:ascii="Garamond" w:hAnsi="Garamond"/>
-          <w:sz w:val="28"/>
-          <w:szCs w:val="28"/>
-        </w:rPr>
-      </w:pPr>
-    </w:p>
-    <w:p>
-      <w:pPr>
-        <w:rPr>
-          <w:rFonts w:ascii="Garamond" w:hAnsi="Garamond"/>
-          <w:sz w:val="28"/>
-          <w:szCs w:val="28"/>
-        </w:rPr>
-      </w:pPr>
-    </w:p>
-    <w:p>
-      <w:pPr>
-        <w:rPr>
-          <w:rFonts w:ascii="Garamond" w:hAnsi="Garamond"/>
-          <w:sz w:val="28"/>
-          <w:szCs w:val="28"/>
+        <w:t>Describe a specific moment this year when you felt proud of something you accomplished in CS</w:t>
+      </w:r>
+      <w:r>
+        <w:rPr>
+          <w:rFonts w:ascii="Garamond" w:hAnsi="Garamond"/>
+        </w:rPr>
+        <w:t>.</w:t>
+      </w:r>
+    </w:p>
+    <w:p>
+      <w:pPr>
+        <w:rPr>
+          <w:rFonts w:ascii="Garamond" w:hAnsi="Garamond"/>
+        </w:rPr>
+      </w:pPr>
+    </w:p>
+    <w:p>
+      <w:pPr>
+        <w:rPr>
+          <w:rFonts w:ascii="Garamond" w:hAnsi="Garamond"/>
+        </w:rPr>
+      </w:pPr>
+    </w:p>
+    <w:p>
+      <w:pPr>
+        <w:rPr>
+          <w:rFonts w:ascii="Garamond" w:hAnsi="Garamond"/>
+        </w:rPr>
+      </w:pPr>
+    </w:p>
+    <w:p>
+      <w:pPr>
+        <w:rPr>
+          <w:rFonts w:ascii="Garamond" w:hAnsi="Garamond"/>
+        </w:rPr>
+      </w:pPr>
+    </w:p>
+    <w:p>
+      <w:pPr>
+        <w:rPr>
+          <w:rFonts w:ascii="Garamond" w:hAnsi="Garamond"/>
+        </w:rPr>
+      </w:pPr>
+    </w:p>
+    <w:p>
+      <w:pPr>
+        <w:rPr>
+          <w:rFonts w:ascii="Garamond" w:hAnsi="Garamond"/>
         </w:rPr>
       </w:pPr>
     </w:p>
@@ -638,77 +1351,54 @@
         </w:numPr>
         <w:rPr>
           <w:rFonts w:ascii="Garamond" w:hAnsi="Garamond"/>
-          <w:sz w:val="28"/>
-          <w:szCs w:val="28"/>
-        </w:rPr>
-      </w:pPr>
-      <w:r>
-        <w:rPr>
-          <w:rFonts w:ascii="Garamond" w:hAnsi="Garamond"/>
-          <w:sz w:val="28"/>
-          <w:szCs w:val="28"/>
-        </w:rPr>
-        <w:t xml:space="preserve">How does the workload </w:t>
-      </w:r>
-      <w:r>
-        <w:rPr>
-          <w:rFonts w:ascii="Garamond" w:hAnsi="Garamond"/>
-          <w:sz w:val="28"/>
-          <w:szCs w:val="28"/>
-        </w:rPr>
-        <w:t xml:space="preserve">for this class </w:t>
-      </w:r>
-      <w:r>
-        <w:rPr>
-          <w:rFonts w:ascii="Garamond" w:hAnsi="Garamond"/>
-          <w:sz w:val="28"/>
-          <w:szCs w:val="28"/>
-        </w:rPr>
-        <w:t>compare to other classes?</w:t>
-      </w:r>
-    </w:p>
-    <w:p>
-      <w:pPr>
-        <w:rPr>
-          <w:rFonts w:ascii="Garamond" w:hAnsi="Garamond"/>
-          <w:sz w:val="28"/>
-          <w:szCs w:val="28"/>
-        </w:rPr>
-      </w:pPr>
-    </w:p>
-    <w:p>
-      <w:pPr>
-        <w:rPr>
-          <w:rFonts w:ascii="Garamond" w:hAnsi="Garamond"/>
-          <w:sz w:val="28"/>
-          <w:szCs w:val="28"/>
-        </w:rPr>
-      </w:pPr>
-    </w:p>
-    <w:p>
-      <w:pPr>
-        <w:rPr>
-          <w:rFonts w:ascii="Garamond" w:hAnsi="Garamond"/>
-          <w:sz w:val="28"/>
-          <w:szCs w:val="28"/>
-        </w:rPr>
-      </w:pPr>
-    </w:p>
-    <w:p>
-      <w:pPr>
-        <w:rPr>
-          <w:rFonts w:ascii="Garamond" w:hAnsi="Garamond"/>
-          <w:sz w:val="28"/>
-          <w:szCs w:val="28"/>
-        </w:rPr>
-      </w:pPr>
-    </w:p>
-    <w:p>
-      <w:pPr>
-        <w:rPr>
-          <w:rFonts w:ascii="Garamond" w:hAnsi="Garamond"/>
-          <w:sz w:val="28"/>
-          <w:szCs w:val="28"/>
+        </w:rPr>
+      </w:pPr>
+      <w:r>
+        <w:rPr>
+          <w:rFonts w:ascii="Garamond" w:hAnsi="Garamond"/>
+        </w:rPr>
+        <w:t>Is there anything else you think I should know about?</w:t>
+      </w:r>
+    </w:p>
+    <w:p>
+      <w:pPr>
+        <w:rPr>
+          <w:rFonts w:ascii="Garamond" w:hAnsi="Garamond"/>
+        </w:rPr>
+      </w:pPr>
+    </w:p>
+    <w:p>
+      <w:pPr>
+        <w:rPr>
+          <w:rFonts w:ascii="Garamond" w:hAnsi="Garamond"/>
+        </w:rPr>
+      </w:pPr>
+    </w:p>
+    <w:p>
+      <w:pPr>
+        <w:rPr>
+          <w:rFonts w:ascii="Garamond" w:hAnsi="Garamond"/>
+        </w:rPr>
+      </w:pPr>
+    </w:p>
+    <w:p>
+      <w:pPr>
+        <w:rPr>
+          <w:rFonts w:ascii="Garamond" w:hAnsi="Garamond"/>
+        </w:rPr>
+      </w:pPr>
+    </w:p>
+    <w:p>
+      <w:pPr>
+        <w:rPr>
+          <w:rFonts w:ascii="Garamond" w:hAnsi="Garamond"/>
+        </w:rPr>
+      </w:pPr>
+    </w:p>
+    <w:p>
+      <w:pPr>
+        <w:rPr>
+          <w:rFonts w:ascii="Garamond" w:hAnsi="Garamond"/>
         </w:rPr>
       </w:pPr>
     </w:p>
@@ -721,135 +1411,45 @@
         </w:numPr>
         <w:rPr>
           <w:rFonts w:ascii="Garamond" w:hAnsi="Garamond"/>
-          <w:sz w:val="28"/>
-          <w:szCs w:val="28"/>
-        </w:rPr>
-      </w:pPr>
-      <w:r>
-        <w:rPr>
-          <w:rFonts w:ascii="Garamond" w:hAnsi="Garamond"/>
-          <w:sz w:val="28"/>
-          <w:szCs w:val="28"/>
-        </w:rPr>
-        <w:t>Do you have any specific suggestions that could improve the class?</w:t>
-      </w:r>
-    </w:p>
-    <w:p>
-      <w:pPr>
-        <w:rPr>
-          <w:rFonts w:ascii="Garamond" w:hAnsi="Garamond"/>
-          <w:sz w:val="28"/>
-          <w:szCs w:val="28"/>
-        </w:rPr>
-      </w:pPr>
-    </w:p>
-    <w:p>
-      <w:pPr>
-        <w:rPr>
-          <w:rFonts w:ascii="Garamond" w:hAnsi="Garamond"/>
-          <w:sz w:val="28"/>
-          <w:szCs w:val="28"/>
-        </w:rPr>
-      </w:pPr>
-    </w:p>
-    <w:p>
-      <w:pPr>
-        <w:rPr>
-          <w:rFonts w:ascii="Garamond" w:hAnsi="Garamond"/>
-          <w:sz w:val="28"/>
-          <w:szCs w:val="28"/>
-        </w:rPr>
-      </w:pPr>
-    </w:p>
-    <w:p>
-      <w:pPr>
-        <w:rPr>
-          <w:rFonts w:ascii="Garamond" w:hAnsi="Garamond"/>
-          <w:sz w:val="28"/>
-          <w:szCs w:val="28"/>
-        </w:rPr>
-      </w:pPr>
-    </w:p>
-    <w:p>
-      <w:pPr>
-        <w:rPr>
-          <w:rFonts w:ascii="Garamond" w:hAnsi="Garamond"/>
-          <w:sz w:val="28"/>
-          <w:szCs w:val="28"/>
-        </w:rPr>
-      </w:pPr>
-    </w:p>
-    <w:p>
-      <w:pPr>
-        <w:pStyle w:val="ListParagraph"/>
-        <w:numPr>
-          <w:ilvl w:val="0"/>
-          <w:numId w:val="1"/>
-        </w:numPr>
-        <w:rPr>
-          <w:rFonts w:ascii="Garamond" w:hAnsi="Garamond"/>
-          <w:sz w:val="28"/>
-          <w:szCs w:val="28"/>
-        </w:rPr>
-      </w:pPr>
-      <w:r>
-        <w:rPr>
-          <w:rFonts w:ascii="Garamond" w:hAnsi="Garamond"/>
-          <w:sz w:val="28"/>
-          <w:szCs w:val="28"/>
-        </w:rPr>
-        <w:t xml:space="preserve">Draw </w:t>
-      </w:r>
-      <w:r>
-        <w:rPr>
-          <w:rFonts w:ascii="Garamond" w:hAnsi="Garamond"/>
-          <w:sz w:val="28"/>
-          <w:szCs w:val="28"/>
-        </w:rPr>
-        <w:t xml:space="preserve">your best idyllic mountain scene with </w:t>
-      </w:r>
-      <w:r>
-        <w:rPr>
-          <w:rFonts w:ascii="Garamond" w:hAnsi="Garamond"/>
-          <w:sz w:val="28"/>
-          <w:szCs w:val="28"/>
+        </w:rPr>
+      </w:pPr>
+      <w:r>
+        <w:rPr>
+          <w:rFonts w:ascii="Garamond" w:hAnsi="Garamond"/>
+        </w:rPr>
+        <w:t>In the space below</w:t>
+      </w:r>
+      <w:r>
+        <w:rPr>
+          <w:rFonts w:ascii="Garamond" w:hAnsi="Garamond"/>
+        </w:rPr>
+        <w:t xml:space="preserve">, draw your best idyllic mountain scene with </w:t>
+      </w:r>
+      <w:r>
+        <w:rPr>
+          <w:rFonts w:ascii="Garamond" w:hAnsi="Garamond"/>
         </w:rPr>
         <w:t xml:space="preserve">fractal </w:t>
       </w:r>
       <w:r>
         <w:rPr>
           <w:rFonts w:ascii="Garamond" w:hAnsi="Garamond"/>
-          <w:sz w:val="28"/>
-          <w:szCs w:val="28"/>
-        </w:rPr>
-        <w:t>mountains and</w:t>
-      </w:r>
-      <w:r>
-        <w:rPr>
-          <w:rFonts w:ascii="Garamond" w:hAnsi="Garamond"/>
-          <w:sz w:val="28"/>
-          <w:szCs w:val="28"/>
-        </w:rPr>
-        <w:t xml:space="preserve"> fractal</w:t>
-      </w:r>
-      <w:r>
-        <w:rPr>
-          <w:rFonts w:ascii="Garamond" w:hAnsi="Garamond"/>
-          <w:sz w:val="28"/>
-          <w:szCs w:val="28"/>
-        </w:rPr>
-        <w:t xml:space="preserve"> tree</w:t>
-      </w:r>
-      <w:r>
-        <w:rPr>
-          <w:rFonts w:ascii="Garamond" w:hAnsi="Garamond"/>
-          <w:sz w:val="28"/>
-          <w:szCs w:val="28"/>
-        </w:rPr>
-        <w:t>s.</w:t>
-      </w:r>
-    </w:p>
-    <w:p/>
+        </w:rPr>
+        <w:t xml:space="preserve">mountains and </w:t>
+      </w:r>
+      <w:r>
+        <w:rPr>
+          <w:rFonts w:ascii="Garamond" w:hAnsi="Garamond"/>
+        </w:rPr>
+        <w:t xml:space="preserve">fractal </w:t>
+      </w:r>
+      <w:r>
+        <w:rPr>
+          <w:rFonts w:ascii="Garamond" w:hAnsi="Garamond"/>
+        </w:rPr>
+        <w:t>trees (bonus points for including a mountain goat):</w:t>
+      </w:r>
+    </w:p>
     <w:sectPr>
       <w:pgSz w:w="12240" w:h="15840"/>
       <w:pgMar w:top="1440" w:right="1440" w:bottom="1440" w:left="1440" w:header="720" w:footer="720" w:gutter="0"/>
@@ -861,7 +1461,7 @@
 </file>
 
 <file path=word/numbering.xml><?xml version="1.0" encoding="utf-8"?>
-<w:numbering xmlns:wpc="http://schemas.microsoft.com/office/word/2010/wordprocessingCanvas" xmlns:cx="http://schemas.microsoft.com/office/drawing/2014/chartex" xmlns:cx1="http://schemas.microsoft.com/office/drawing/2015/9/8/chartex" xmlns:cx2="http://schemas.microsoft.com/office/drawing/2015/10/21/chartex" xmlns:cx3="http://schemas.microsoft.com/office/drawing/2016/5/9/chartex" xmlns:cx4="http://schemas.microsoft.com/office/drawing/2016/5/10/chartex" xmlns:cx5="http://schemas.microsoft.com/office/drawing/2016/5/11/chartex" xmlns:cx6="http://schemas.microsoft.com/office/drawing/2016/5/12/chartex" xmlns:cx7="http://schemas.microsoft.com/office/drawing/2016/5/13/chartex" xmlns:cx8="http://schemas.microsoft.com/office/drawing/2016/5/14/chartex" xmlns:mc="http://schemas.openxmlformats.org/markup-compatibility/2006" xmlns:aink="http://schemas.microsoft.com/office/drawing/2016/ink" xmlns:am3d="http://schemas.microsoft.com/office/drawing/2017/model3d" xmlns:o="urn:schemas-microsoft-com:office:office" xmlns:oel="http://schemas.microsoft.com/office/2019/extlst" xmlns:r="http://schemas.openxmlformats.org/officeDocument/2006/relationships" xmlns:m="http://schemas.openxmlformats.org/officeDocument/2006/math" xmlns:v="urn:schemas-microsoft-com:vml" xmlns:wp14="http://schemas.microsoft.com/office/word/2010/wordprocessingDrawing" xmlns:wp="http://schemas.openxmlformats.org/drawingml/2006/wordprocessingDrawing" xmlns:w10="urn:schemas-microsoft-com:office:word" xmlns:w="http://schemas.openxmlformats.org/wordprocessingml/2006/main" xmlns:w14="http://schemas.microsoft.com/office/word/2010/wordml" xmlns:w15="http://schemas.microsoft.com/office/word/2012/wordml" xmlns:w16cex="http://schemas.microsoft.com/office/word/2018/wordml/cex" xmlns:w16cid="http://schemas.microsoft.com/office/word/2016/wordml/cid" xmlns:w16="http://schemas.microsoft.com/office/word/2018/wordml" xmlns:w16sdtdh="http://schemas.microsoft.com/office/word/2020/wordml/sdtdatahash" xmlns:w16se="http://schemas.microsoft.com/office/word/2015/wordml/symex" xmlns:wpg="http://schemas.microsoft.com/office/word/2010/wordprocessingGroup" xmlns:wpi="http://schemas.microsoft.com/office/word/2010/wordprocessingInk" xmlns:wne="http://schemas.microsoft.com/office/word/2006/wordml" xmlns:wps="http://schemas.microsoft.com/office/word/2010/wordprocessingShape" mc:Ignorable="w14 w15 w16se w16cid w16 w16cex w16sdtdh wp14">
+<w:numbering xmlns:wpc="http://schemas.microsoft.com/office/word/2010/wordprocessingCanvas" xmlns:cx="http://schemas.microsoft.com/office/drawing/2014/chartex" xmlns:cx1="http://schemas.microsoft.com/office/drawing/2015/9/8/chartex" xmlns:cx2="http://schemas.microsoft.com/office/drawing/2015/10/21/chartex" xmlns:cx3="http://schemas.microsoft.com/office/drawing/2016/5/9/chartex" xmlns:cx4="http://schemas.microsoft.com/office/drawing/2016/5/10/chartex" xmlns:cx5="http://schemas.microsoft.com/office/drawing/2016/5/11/chartex" xmlns:cx6="http://schemas.microsoft.com/office/drawing/2016/5/12/chartex" xmlns:cx7="http://schemas.microsoft.com/office/drawing/2016/5/13/chartex" xmlns:cx8="http://schemas.microsoft.com/office/drawing/2016/5/14/chartex" xmlns:mc="http://schemas.openxmlformats.org/markup-compatibility/2006" xmlns:aink="http://schemas.microsoft.com/office/drawing/2016/ink" xmlns:am3d="http://schemas.microsoft.com/office/drawing/2017/model3d" xmlns:o="urn:schemas-microsoft-com:office:office" xmlns:oel="http://schemas.microsoft.com/office/2019/extlst" xmlns:r="http://schemas.openxmlformats.org/officeDocument/2006/relationships" xmlns:m="http://schemas.openxmlformats.org/officeDocument/2006/math" xmlns:v="urn:schemas-microsoft-com:vml" xmlns:wp14="http://schemas.microsoft.com/office/word/2010/wordprocessingDrawing" xmlns:wp="http://schemas.openxmlformats.org/drawingml/2006/wordprocessingDrawing" xmlns:w10="urn:schemas-microsoft-com:office:word" xmlns:w="http://schemas.openxmlformats.org/wordprocessingml/2006/main" xmlns:w14="http://schemas.microsoft.com/office/word/2010/wordml" xmlns:w15="http://schemas.microsoft.com/office/word/2012/wordml" xmlns:w16cex="http://schemas.microsoft.com/office/word/2018/wordml/cex" xmlns:w16cid="http://schemas.microsoft.com/office/word/2016/wordml/cid" xmlns:w16="http://schemas.microsoft.com/office/word/2018/wordml" xmlns:w16du="http://schemas.microsoft.com/office/word/2023/wordml/word16du" xmlns:w16sdtdh="http://schemas.microsoft.com/office/word/2020/wordml/sdtdatahash" xmlns:w16sdtfl="http://schemas.microsoft.com/office/word/2024/wordml/sdtformatlock" xmlns:w16se="http://schemas.microsoft.com/office/word/2015/wordml/symex" xmlns:wpg="http://schemas.microsoft.com/office/word/2010/wordprocessingGroup" xmlns:wpi="http://schemas.microsoft.com/office/word/2010/wordprocessingInk" xmlns:wne="http://schemas.microsoft.com/office/word/2006/wordml" xmlns:wps="http://schemas.microsoft.com/office/word/2010/wordprocessingShape" mc:Ignorable="w14 w15 w16se w16cid w16 w16cex w16sdtdh w16sdtfl w16du wp14">
   <w:abstractNum w:abstractNumId="0" w15:restartNumberingAfterBreak="0">
     <w:nsid w:val="66AF1173"/>
     <w:multiLevelType w:val="hybridMultilevel"/>
@@ -878,7 +1478,7 @@
         <w:rFonts w:hint="default"/>
       </w:rPr>
     </w:lvl>
-    <w:lvl w:ilvl="1" w:tplc="04090019" w:tentative="1">
+    <w:lvl w:ilvl="1" w:tplc="04090019">
       <w:start w:val="1"/>
       <w:numFmt w:val="lowerLetter"/>
       <w:lvlText w:val="%2."/>
@@ -951,14 +1551,106 @@
       </w:pPr>
     </w:lvl>
   </w:abstractNum>
+  <w:abstractNum w:abstractNumId="1" w15:restartNumberingAfterBreak="0">
+    <w:nsid w:val="7CBB685E"/>
+    <w:multiLevelType w:val="hybridMultilevel"/>
+    <w:tmpl w:val="EE3AA720"/>
+    <w:lvl w:ilvl="0" w:tplc="0409000F">
+      <w:start w:val="1"/>
+      <w:numFmt w:val="decimal"/>
+      <w:lvlText w:val="%1."/>
+      <w:lvlJc w:val="left"/>
+      <w:pPr>
+        <w:ind w:left="720" w:hanging="360"/>
+      </w:pPr>
+      <w:rPr>
+        <w:rFonts w:hint="default"/>
+      </w:rPr>
+    </w:lvl>
+    <w:lvl w:ilvl="1" w:tplc="04090019">
+      <w:start w:val="1"/>
+      <w:numFmt w:val="lowerLetter"/>
+      <w:lvlText w:val="%2."/>
+      <w:lvlJc w:val="left"/>
+      <w:pPr>
+        <w:ind w:left="1440" w:hanging="360"/>
+      </w:pPr>
+    </w:lvl>
+    <w:lvl w:ilvl="2" w:tplc="0409001B" w:tentative="1">
+      <w:start w:val="1"/>
+      <w:numFmt w:val="lowerRoman"/>
+      <w:lvlText w:val="%3."/>
+      <w:lvlJc w:val="right"/>
+      <w:pPr>
+        <w:ind w:left="2160" w:hanging="180"/>
+      </w:pPr>
+    </w:lvl>
+    <w:lvl w:ilvl="3" w:tplc="0409000F" w:tentative="1">
+      <w:start w:val="1"/>
+      <w:numFmt w:val="decimal"/>
+      <w:lvlText w:val="%4."/>
+      <w:lvlJc w:val="left"/>
+      <w:pPr>
+        <w:ind w:left="2880" w:hanging="360"/>
+      </w:pPr>
+    </w:lvl>
+    <w:lvl w:ilvl="4" w:tplc="04090019" w:tentative="1">
+      <w:start w:val="1"/>
+      <w:numFmt w:val="lowerLetter"/>
+      <w:lvlText w:val="%5."/>
+      <w:lvlJc w:val="left"/>
+      <w:pPr>
+        <w:ind w:left="3600" w:hanging="360"/>
+      </w:pPr>
+    </w:lvl>
+    <w:lvl w:ilvl="5" w:tplc="0409001B" w:tentative="1">
+      <w:start w:val="1"/>
+      <w:numFmt w:val="lowerRoman"/>
+      <w:lvlText w:val="%6."/>
+      <w:lvlJc w:val="right"/>
+      <w:pPr>
+        <w:ind w:left="4320" w:hanging="180"/>
+      </w:pPr>
+    </w:lvl>
+    <w:lvl w:ilvl="6" w:tplc="0409000F" w:tentative="1">
+      <w:start w:val="1"/>
+      <w:numFmt w:val="decimal"/>
+      <w:lvlText w:val="%7."/>
+      <w:lvlJc w:val="left"/>
+      <w:pPr>
+        <w:ind w:left="5040" w:hanging="360"/>
+      </w:pPr>
+    </w:lvl>
+    <w:lvl w:ilvl="7" w:tplc="04090019" w:tentative="1">
+      <w:start w:val="1"/>
+      <w:numFmt w:val="lowerLetter"/>
+      <w:lvlText w:val="%8."/>
+      <w:lvlJc w:val="left"/>
+      <w:pPr>
+        <w:ind w:left="5760" w:hanging="360"/>
+      </w:pPr>
+    </w:lvl>
+    <w:lvl w:ilvl="8" w:tplc="0409001B" w:tentative="1">
+      <w:start w:val="1"/>
+      <w:numFmt w:val="lowerRoman"/>
+      <w:lvlText w:val="%9."/>
+      <w:lvlJc w:val="right"/>
+      <w:pPr>
+        <w:ind w:left="6480" w:hanging="180"/>
+      </w:pPr>
+    </w:lvl>
+  </w:abstractNum>
   <w:num w:numId="1" w16cid:durableId="849565987">
     <w:abstractNumId w:val="0"/>
+  </w:num>
+  <w:num w:numId="2" w16cid:durableId="652492760">
+    <w:abstractNumId w:val="1"/>
   </w:num>
 </w:numbering>
 </file>
 
 <file path=word/styles.xml><?xml version="1.0" encoding="utf-8"?>
-<w:styles xmlns:mc="http://schemas.openxmlformats.org/markup-compatibility/2006" xmlns:r="http://schemas.openxmlformats.org/officeDocument/2006/relationships" xmlns:w="http://schemas.openxmlformats.org/wordprocessingml/2006/main" xmlns:w14="http://schemas.microsoft.com/office/word/2010/wordml" xmlns:w15="http://schemas.microsoft.com/office/word/2012/wordml" xmlns:w16cex="http://schemas.microsoft.com/office/word/2018/wordml/cex" xmlns:w16cid="http://schemas.microsoft.com/office/word/2016/wordml/cid" xmlns:w16="http://schemas.microsoft.com/office/word/2018/wordml" xmlns:w16sdtdh="http://schemas.microsoft.com/office/word/2020/wordml/sdtdatahash" xmlns:w16se="http://schemas.microsoft.com/office/word/2015/wordml/symex" mc:Ignorable="w14 w15 w16se w16cid w16 w16cex w16sdtdh">
+<w:styles xmlns:mc="http://schemas.openxmlformats.org/markup-compatibility/2006" xmlns:r="http://schemas.openxmlformats.org/officeDocument/2006/relationships" xmlns:w="http://schemas.openxmlformats.org/wordprocessingml/2006/main" xmlns:w14="http://schemas.microsoft.com/office/word/2010/wordml" xmlns:w15="http://schemas.microsoft.com/office/word/2012/wordml" xmlns:w16cex="http://schemas.microsoft.com/office/word/2018/wordml/cex" xmlns:w16cid="http://schemas.microsoft.com/office/word/2016/wordml/cid" xmlns:w16="http://schemas.microsoft.com/office/word/2018/wordml" xmlns:w16du="http://schemas.microsoft.com/office/word/2023/wordml/word16du" xmlns:w16sdtdh="http://schemas.microsoft.com/office/word/2020/wordml/sdtdatahash" xmlns:w16sdtfl="http://schemas.microsoft.com/office/word/2024/wordml/sdtformatlock" xmlns:w16se="http://schemas.microsoft.com/office/word/2015/wordml/symex" mc:Ignorable="w14 w15 w16se w16cid w16 w16cex w16sdtdh w16sdtfl w16du">
   <w:docDefaults>
     <w:rPrDefault>
       <w:rPr>

</xml_diff>

<commit_message>
Update reference to worksheets
</commit_message>
<xml_diff>
--- a/CourseMaterial/07_wrapup/00_offboarding/exit_questionaire.docx
+++ b/CourseMaterial/07_wrapup/00_offboarding/exit_questionaire.docx
@@ -6,8 +6,6 @@
       <w:pPr>
         <w:rPr>
           <w:rFonts w:ascii="Garamond" w:hAnsi="Garamond"/>
-          <w:sz w:val="28"/>
-          <w:szCs w:val="28"/>
         </w:rPr>
       </w:pPr>
       <w:r>
@@ -18,7 +16,7 @@
           <w:sz w:val="28"/>
           <w:szCs w:val="28"/>
         </w:rPr>
-        <w:t>It Was Nice to Meet You!                           Name: ________________</w:t>
+        <w:t>It Was Nice to Meet You!                                    Name: ____________________</w:t>
       </w:r>
     </w:p>
     <w:p>
@@ -163,7 +161,25 @@
         <w:rPr>
           <w:rFonts w:ascii="Garamond" w:hAnsi="Garamond"/>
         </w:rPr>
-        <w:t>Rate how much each activity helped your learning</w:t>
+        <w:t xml:space="preserve">Rate how much each </w:t>
+      </w:r>
+      <w:r>
+        <w:rPr>
+          <w:rFonts w:ascii="Garamond" w:hAnsi="Garamond"/>
+        </w:rPr>
+        <w:t>unit</w:t>
+      </w:r>
+      <w:r>
+        <w:rPr>
+          <w:rFonts w:ascii="Garamond" w:hAnsi="Garamond"/>
+        </w:rPr>
+        <w:t xml:space="preserve"> helped your </w:t>
+      </w:r>
+      <w:r>
+        <w:rPr>
+          <w:rFonts w:ascii="Garamond" w:hAnsi="Garamond"/>
+        </w:rPr>
+        <w:t>understanding of CS</w:t>
       </w:r>
       <w:r>
         <w:rPr>
@@ -175,7 +191,31 @@
         <w:rPr>
           <w:rFonts w:ascii="Garamond" w:hAnsi="Garamond"/>
         </w:rPr>
-        <w:t>1 (strongly disagree) - 10 (strongly agree):</w:t>
+        <w:t>1 (</w:t>
+      </w:r>
+      <w:r>
+        <w:rPr>
+          <w:rFonts w:ascii="Garamond" w:hAnsi="Garamond"/>
+        </w:rPr>
+        <w:t>not at all</w:t>
+      </w:r>
+      <w:r>
+        <w:rPr>
+          <w:rFonts w:ascii="Garamond" w:hAnsi="Garamond"/>
+        </w:rPr>
+        <w:t>) - 10 (</w:t>
+      </w:r>
+      <w:r>
+        <w:rPr>
+          <w:rFonts w:ascii="Garamond" w:hAnsi="Garamond"/>
+        </w:rPr>
+        <w:t>a ton</w:t>
+      </w:r>
+      <w:r>
+        <w:rPr>
+          <w:rFonts w:ascii="Garamond" w:hAnsi="Garamond"/>
+        </w:rPr>
+        <w:t>):</w:t>
       </w:r>
     </w:p>
     <w:p>
@@ -295,6 +335,7 @@
     </w:p>
     <w:p>
       <w:pPr>
+        <w:pStyle w:val="ListParagraph"/>
         <w:rPr>
           <w:rFonts w:ascii="Garamond" w:hAnsi="Garamond"/>
         </w:rPr>
@@ -311,28 +352,23 @@
           <w:rFonts w:ascii="Garamond" w:hAnsi="Garamond"/>
         </w:rPr>
       </w:pPr>
-      <w:r>
-        <w:rPr>
-          <w:rFonts w:ascii="Garamond" w:hAnsi="Garamond"/>
-        </w:rPr>
-        <w:t>Fractals and Recursion</w:t>
-      </w:r>
-      <w:r>
-        <w:rPr>
-          <w:rFonts w:ascii="Garamond" w:hAnsi="Garamond"/>
-        </w:rPr>
-        <w:t xml:space="preserve">: </w:t>
-      </w:r>
-      <w:r>
-        <w:rPr>
-          <w:rFonts w:ascii="Garamond" w:hAnsi="Garamond"/>
-        </w:rPr>
-        <w:t>___</w:t>
-      </w:r>
-    </w:p>
-    <w:p>
-      <w:pPr>
-        <w:pStyle w:val="ListParagraph"/>
+      <w:proofErr w:type="spellStart"/>
+      <w:r>
+        <w:rPr>
+          <w:rFonts w:ascii="Garamond" w:hAnsi="Garamond"/>
+        </w:rPr>
+        <w:t>Turbozzle</w:t>
+      </w:r>
+      <w:proofErr w:type="spellEnd"/>
+      <w:r>
+        <w:rPr>
+          <w:rFonts w:ascii="Garamond" w:hAnsi="Garamond"/>
+        </w:rPr>
+        <w:t>: ___</w:t>
+      </w:r>
+    </w:p>
+    <w:p>
+      <w:pPr>
         <w:rPr>
           <w:rFonts w:ascii="Garamond" w:hAnsi="Garamond"/>
         </w:rPr>
@@ -349,76 +385,43 @@
           <w:rFonts w:ascii="Garamond" w:hAnsi="Garamond"/>
         </w:rPr>
       </w:pPr>
+      <w:r>
+        <w:rPr>
+          <w:rFonts w:ascii="Garamond" w:hAnsi="Garamond"/>
+        </w:rPr>
+        <w:t>Lists &amp; Prisoner's Dilemma: ___</w:t>
+      </w:r>
+    </w:p>
+    <w:p>
+      <w:pPr>
+        <w:rPr>
+          <w:rFonts w:ascii="Garamond" w:hAnsi="Garamond"/>
+        </w:rPr>
+      </w:pPr>
+    </w:p>
+    <w:p>
+      <w:pPr>
+        <w:pStyle w:val="ListParagraph"/>
+        <w:numPr>
+          <w:ilvl w:val="1"/>
+          <w:numId w:val="1"/>
+        </w:numPr>
+        <w:rPr>
+          <w:rFonts w:ascii="Garamond" w:hAnsi="Garamond"/>
+        </w:rPr>
+      </w:pPr>
       <w:proofErr w:type="spellStart"/>
       <w:r>
         <w:rPr>
           <w:rFonts w:ascii="Garamond" w:hAnsi="Garamond"/>
         </w:rPr>
-        <w:t>Turbozzle</w:t>
+        <w:t>PythoShop</w:t>
       </w:r>
       <w:proofErr w:type="spellEnd"/>
       <w:r>
         <w:rPr>
           <w:rFonts w:ascii="Garamond" w:hAnsi="Garamond"/>
         </w:rPr>
-        <w:t>: ___</w:t>
-      </w:r>
-    </w:p>
-    <w:p>
-      <w:pPr>
-        <w:rPr>
-          <w:rFonts w:ascii="Garamond" w:hAnsi="Garamond"/>
-        </w:rPr>
-      </w:pPr>
-    </w:p>
-    <w:p>
-      <w:pPr>
-        <w:pStyle w:val="ListParagraph"/>
-        <w:numPr>
-          <w:ilvl w:val="1"/>
-          <w:numId w:val="1"/>
-        </w:numPr>
-        <w:rPr>
-          <w:rFonts w:ascii="Garamond" w:hAnsi="Garamond"/>
-        </w:rPr>
-      </w:pPr>
-      <w:r>
-        <w:rPr>
-          <w:rFonts w:ascii="Garamond" w:hAnsi="Garamond"/>
-        </w:rPr>
-        <w:t>Lists &amp; Prisoner's Dilemma: ___</w:t>
-      </w:r>
-    </w:p>
-    <w:p>
-      <w:pPr>
-        <w:rPr>
-          <w:rFonts w:ascii="Garamond" w:hAnsi="Garamond"/>
-        </w:rPr>
-      </w:pPr>
-    </w:p>
-    <w:p>
-      <w:pPr>
-        <w:pStyle w:val="ListParagraph"/>
-        <w:numPr>
-          <w:ilvl w:val="1"/>
-          <w:numId w:val="1"/>
-        </w:numPr>
-        <w:rPr>
-          <w:rFonts w:ascii="Garamond" w:hAnsi="Garamond"/>
-        </w:rPr>
-      </w:pPr>
-      <w:proofErr w:type="spellStart"/>
-      <w:r>
-        <w:rPr>
-          <w:rFonts w:ascii="Garamond" w:hAnsi="Garamond"/>
-        </w:rPr>
-        <w:t>PythoShop</w:t>
-      </w:r>
-      <w:proofErr w:type="spellEnd"/>
-      <w:r>
-        <w:rPr>
-          <w:rFonts w:ascii="Garamond" w:hAnsi="Garamond"/>
-        </w:rPr>
         <w:t xml:space="preserve"> project: ___</w:t>
       </w:r>
     </w:p>
@@ -549,6 +552,20 @@
         </w:rPr>
         <w:t>?</w:t>
       </w:r>
+    </w:p>
+    <w:p>
+      <w:pPr>
+        <w:rPr>
+          <w:rFonts w:ascii="Garamond" w:hAnsi="Garamond"/>
+        </w:rPr>
+      </w:pPr>
+    </w:p>
+    <w:p>
+      <w:pPr>
+        <w:rPr>
+          <w:rFonts w:ascii="Garamond" w:hAnsi="Garamond"/>
+        </w:rPr>
+      </w:pPr>
     </w:p>
     <w:p>
       <w:pPr>
@@ -849,7 +866,38 @@
         <w:rPr>
           <w:rFonts w:ascii="Garamond" w:hAnsi="Garamond"/>
         </w:rPr>
-        <w:t xml:space="preserve">Studying for tests: </w:t>
+        <w:t xml:space="preserve">Studying for tests: ___ hours </w:t>
+      </w:r>
+      <w:r>
+        <w:rPr>
+          <w:rFonts w:ascii="Garamond" w:hAnsi="Garamond"/>
+        </w:rPr>
+        <w:t>/ test</w:t>
+      </w:r>
+    </w:p>
+    <w:p>
+      <w:pPr>
+        <w:rPr>
+          <w:rFonts w:ascii="Garamond" w:hAnsi="Garamond"/>
+        </w:rPr>
+      </w:pPr>
+    </w:p>
+    <w:p>
+      <w:pPr>
+        <w:pStyle w:val="ListParagraph"/>
+        <w:numPr>
+          <w:ilvl w:val="1"/>
+          <w:numId w:val="1"/>
+        </w:numPr>
+        <w:rPr>
+          <w:rFonts w:ascii="Garamond" w:hAnsi="Garamond"/>
+        </w:rPr>
+      </w:pPr>
+      <w:r>
+        <w:rPr>
+          <w:rFonts w:ascii="Garamond" w:hAnsi="Garamond"/>
+        </w:rPr>
+        <w:t xml:space="preserve">Misc work: </w:t>
       </w:r>
       <w:r>
         <w:rPr>
@@ -861,17 +909,109 @@
         <w:rPr>
           <w:rFonts w:ascii="Garamond" w:hAnsi="Garamond"/>
         </w:rPr>
-        <w:t xml:space="preserve"> hours </w:t>
-      </w:r>
-      <w:r>
-        <w:rPr>
-          <w:rFonts w:ascii="Garamond" w:hAnsi="Garamond"/>
-        </w:rPr>
-        <w:t>/ test</w:t>
-      </w:r>
-    </w:p>
-    <w:p>
-      <w:pPr>
+        <w:t xml:space="preserve"> hours /week</w:t>
+      </w:r>
+    </w:p>
+    <w:p>
+      <w:pPr>
+        <w:rPr>
+          <w:rFonts w:ascii="Garamond" w:hAnsi="Garamond"/>
+        </w:rPr>
+      </w:pPr>
+    </w:p>
+    <w:p>
+      <w:pPr>
+        <w:rPr>
+          <w:rFonts w:ascii="Garamond" w:hAnsi="Garamond"/>
+        </w:rPr>
+      </w:pPr>
+    </w:p>
+    <w:p>
+      <w:pPr>
+        <w:pStyle w:val="ListParagraph"/>
+        <w:numPr>
+          <w:ilvl w:val="0"/>
+          <w:numId w:val="1"/>
+        </w:numPr>
+        <w:rPr>
+          <w:rFonts w:ascii="Garamond" w:hAnsi="Garamond"/>
+        </w:rPr>
+      </w:pPr>
+      <w:r>
+        <w:rPr>
+          <w:rFonts w:ascii="Garamond" w:hAnsi="Garamond"/>
+        </w:rPr>
+        <w:t xml:space="preserve">How does the workload </w:t>
+      </w:r>
+      <w:r>
+        <w:rPr>
+          <w:rFonts w:ascii="Garamond" w:hAnsi="Garamond"/>
+        </w:rPr>
+        <w:t xml:space="preserve">for this class </w:t>
+      </w:r>
+      <w:r>
+        <w:rPr>
+          <w:rFonts w:ascii="Garamond" w:hAnsi="Garamond"/>
+        </w:rPr>
+        <w:t>compare to other classes?</w:t>
+      </w:r>
+    </w:p>
+    <w:p>
+      <w:pPr>
+        <w:rPr>
+          <w:rFonts w:ascii="Garamond" w:hAnsi="Garamond"/>
+        </w:rPr>
+      </w:pPr>
+    </w:p>
+    <w:p>
+      <w:pPr>
+        <w:rPr>
+          <w:rFonts w:ascii="Garamond" w:hAnsi="Garamond"/>
+        </w:rPr>
+      </w:pPr>
+    </w:p>
+    <w:p>
+      <w:pPr>
+        <w:rPr>
+          <w:rFonts w:ascii="Garamond" w:hAnsi="Garamond"/>
+        </w:rPr>
+      </w:pPr>
+    </w:p>
+    <w:p>
+      <w:pPr>
+        <w:rPr>
+          <w:rFonts w:ascii="Garamond" w:hAnsi="Garamond"/>
+        </w:rPr>
+      </w:pPr>
+    </w:p>
+    <w:p>
+      <w:pPr>
+        <w:rPr>
+          <w:rFonts w:ascii="Garamond" w:hAnsi="Garamond"/>
+        </w:rPr>
+      </w:pPr>
+    </w:p>
+    <w:p>
+      <w:pPr>
+        <w:pStyle w:val="ListParagraph"/>
+        <w:numPr>
+          <w:ilvl w:val="0"/>
+          <w:numId w:val="1"/>
+        </w:numPr>
+        <w:rPr>
+          <w:rFonts w:ascii="Garamond" w:hAnsi="Garamond"/>
+        </w:rPr>
+      </w:pPr>
+      <w:r>
+        <w:rPr>
+          <w:rFonts w:ascii="Garamond" w:hAnsi="Garamond"/>
+        </w:rPr>
+        <w:t>Rate the following statements on a scale of 1 (strongly disagree) - 10 (strongly agree):</w:t>
+      </w:r>
+    </w:p>
+    <w:p>
+      <w:pPr>
+        <w:ind w:left="360"/>
         <w:rPr>
           <w:rFonts w:ascii="Garamond" w:hAnsi="Garamond"/>
         </w:rPr>
@@ -892,27 +1032,276 @@
         <w:rPr>
           <w:rFonts w:ascii="Garamond" w:hAnsi="Garamond"/>
         </w:rPr>
-        <w:t xml:space="preserve">Misc work: </w:t>
-      </w:r>
-      <w:r>
-        <w:rPr>
-          <w:rFonts w:ascii="Garamond" w:hAnsi="Garamond"/>
-        </w:rPr>
-        <w:t>___</w:t>
-      </w:r>
-      <w:r>
-        <w:rPr>
-          <w:rFonts w:ascii="Garamond" w:hAnsi="Garamond"/>
-        </w:rPr>
-        <w:t xml:space="preserve"> hours /week</w:t>
-      </w:r>
-    </w:p>
-    <w:p>
-      <w:pPr>
-        <w:rPr>
-          <w:rFonts w:ascii="Garamond" w:hAnsi="Garamond"/>
-        </w:rPr>
-      </w:pPr>
+        <w:t>My teacher was prepared for class: ___</w:t>
+      </w:r>
+    </w:p>
+    <w:p>
+      <w:pPr>
+        <w:pStyle w:val="ListParagraph"/>
+        <w:rPr>
+          <w:rFonts w:ascii="Garamond" w:hAnsi="Garamond"/>
+        </w:rPr>
+      </w:pPr>
+    </w:p>
+    <w:p>
+      <w:pPr>
+        <w:pStyle w:val="ListParagraph"/>
+        <w:numPr>
+          <w:ilvl w:val="1"/>
+          <w:numId w:val="1"/>
+        </w:numPr>
+        <w:rPr>
+          <w:rFonts w:ascii="Garamond" w:hAnsi="Garamond"/>
+        </w:rPr>
+      </w:pPr>
+      <w:r>
+        <w:rPr>
+          <w:rFonts w:ascii="Garamond" w:hAnsi="Garamond"/>
+        </w:rPr>
+        <w:t xml:space="preserve">The </w:t>
+      </w:r>
+      <w:r>
+        <w:rPr>
+          <w:rFonts w:ascii="Garamond" w:hAnsi="Garamond"/>
+        </w:rPr>
+        <w:t>in-class activities and worksheets</w:t>
+      </w:r>
+      <w:r>
+        <w:rPr>
+          <w:rFonts w:ascii="Garamond" w:hAnsi="Garamond"/>
+        </w:rPr>
+        <w:t xml:space="preserve"> helped me understand the material: ___</w:t>
+      </w:r>
+    </w:p>
+    <w:p>
+      <w:pPr>
+        <w:rPr>
+          <w:rFonts w:ascii="Garamond" w:hAnsi="Garamond"/>
+        </w:rPr>
+      </w:pPr>
+    </w:p>
+    <w:p>
+      <w:pPr>
+        <w:pStyle w:val="ListParagraph"/>
+        <w:numPr>
+          <w:ilvl w:val="1"/>
+          <w:numId w:val="1"/>
+        </w:numPr>
+        <w:rPr>
+          <w:rFonts w:ascii="Garamond" w:hAnsi="Garamond"/>
+        </w:rPr>
+      </w:pPr>
+      <w:r>
+        <w:rPr>
+          <w:rFonts w:ascii="Garamond" w:hAnsi="Garamond"/>
+        </w:rPr>
+        <w:t xml:space="preserve">The </w:t>
+      </w:r>
+      <w:r>
+        <w:rPr>
+          <w:rFonts w:ascii="Garamond" w:hAnsi="Garamond"/>
+        </w:rPr>
+        <w:t>in-class activities</w:t>
+      </w:r>
+      <w:r>
+        <w:rPr>
+          <w:rFonts w:ascii="Garamond" w:hAnsi="Garamond"/>
+        </w:rPr>
+        <w:t xml:space="preserve"> </w:t>
+      </w:r>
+      <w:r>
+        <w:rPr>
+          <w:rFonts w:ascii="Garamond" w:hAnsi="Garamond"/>
+        </w:rPr>
+        <w:t>and worksheets</w:t>
+      </w:r>
+      <w:r>
+        <w:rPr>
+          <w:rFonts w:ascii="Garamond" w:hAnsi="Garamond"/>
+        </w:rPr>
+        <w:t xml:space="preserve"> </w:t>
+      </w:r>
+      <w:r>
+        <w:rPr>
+          <w:rFonts w:ascii="Garamond" w:hAnsi="Garamond"/>
+        </w:rPr>
+        <w:t>were</w:t>
+      </w:r>
+      <w:r>
+        <w:rPr>
+          <w:rFonts w:ascii="Garamond" w:hAnsi="Garamond"/>
+        </w:rPr>
+        <w:t xml:space="preserve"> engaging and interesting: ___</w:t>
+      </w:r>
+    </w:p>
+    <w:p>
+      <w:pPr>
+        <w:rPr>
+          <w:rFonts w:ascii="Garamond" w:hAnsi="Garamond"/>
+        </w:rPr>
+      </w:pPr>
+    </w:p>
+    <w:p>
+      <w:pPr>
+        <w:pStyle w:val="ListParagraph"/>
+        <w:numPr>
+          <w:ilvl w:val="1"/>
+          <w:numId w:val="1"/>
+        </w:numPr>
+        <w:rPr>
+          <w:rFonts w:ascii="Garamond" w:hAnsi="Garamond"/>
+        </w:rPr>
+      </w:pPr>
+      <w:r>
+        <w:rPr>
+          <w:rFonts w:ascii="Garamond" w:hAnsi="Garamond"/>
+        </w:rPr>
+        <w:t>The homework helped me understand the material: ___</w:t>
+      </w:r>
+    </w:p>
+    <w:p>
+      <w:pPr>
+        <w:pStyle w:val="ListParagraph"/>
+        <w:rPr>
+          <w:rFonts w:ascii="Garamond" w:hAnsi="Garamond"/>
+        </w:rPr>
+      </w:pPr>
+    </w:p>
+    <w:p>
+      <w:pPr>
+        <w:pStyle w:val="ListParagraph"/>
+        <w:numPr>
+          <w:ilvl w:val="1"/>
+          <w:numId w:val="1"/>
+        </w:numPr>
+        <w:rPr>
+          <w:rFonts w:ascii="Garamond" w:hAnsi="Garamond"/>
+        </w:rPr>
+      </w:pPr>
+      <w:r>
+        <w:rPr>
+          <w:rFonts w:ascii="Garamond" w:hAnsi="Garamond"/>
+        </w:rPr>
+        <w:t>The TIL’s helped</w:t>
+      </w:r>
+      <w:r>
+        <w:rPr>
+          <w:rFonts w:ascii="Garamond" w:hAnsi="Garamond"/>
+        </w:rPr>
+        <w:t xml:space="preserve"> refine my understanding and were a useful exercise</w:t>
+      </w:r>
+      <w:r>
+        <w:rPr>
+          <w:rFonts w:ascii="Garamond" w:hAnsi="Garamond"/>
+        </w:rPr>
+        <w:t>: ___</w:t>
+      </w:r>
+    </w:p>
+    <w:p>
+      <w:pPr>
+        <w:rPr>
+          <w:rFonts w:ascii="Garamond" w:hAnsi="Garamond"/>
+        </w:rPr>
+      </w:pPr>
+    </w:p>
+    <w:p>
+      <w:pPr>
+        <w:pStyle w:val="ListParagraph"/>
+        <w:numPr>
+          <w:ilvl w:val="1"/>
+          <w:numId w:val="1"/>
+        </w:numPr>
+        <w:rPr>
+          <w:rFonts w:ascii="Garamond" w:hAnsi="Garamond"/>
+        </w:rPr>
+      </w:pPr>
+      <w:r>
+        <w:rPr>
+          <w:rFonts w:ascii="Garamond" w:hAnsi="Garamond"/>
+        </w:rPr>
+        <w:t>The teacher provided helpful feedback on my work: ___</w:t>
+      </w:r>
+    </w:p>
+    <w:p>
+      <w:pPr>
+        <w:rPr>
+          <w:rFonts w:ascii="Garamond" w:hAnsi="Garamond"/>
+        </w:rPr>
+      </w:pPr>
+    </w:p>
+    <w:p>
+      <w:pPr>
+        <w:pStyle w:val="ListParagraph"/>
+        <w:numPr>
+          <w:ilvl w:val="1"/>
+          <w:numId w:val="1"/>
+        </w:numPr>
+        <w:rPr>
+          <w:rFonts w:ascii="Garamond" w:hAnsi="Garamond"/>
+        </w:rPr>
+      </w:pPr>
+      <w:r>
+        <w:rPr>
+          <w:rFonts w:ascii="Garamond" w:hAnsi="Garamond"/>
+        </w:rPr>
+        <w:t>The tests and assessments accurately captured my understanding</w:t>
+      </w:r>
+      <w:r>
+        <w:rPr>
+          <w:rFonts w:ascii="Garamond" w:hAnsi="Garamond"/>
+        </w:rPr>
+        <w:t>: ___</w:t>
+      </w:r>
+    </w:p>
+    <w:p>
+      <w:pPr>
+        <w:rPr>
+          <w:rFonts w:ascii="Garamond" w:hAnsi="Garamond"/>
+        </w:rPr>
+      </w:pPr>
+    </w:p>
+    <w:p>
+      <w:pPr>
+        <w:pStyle w:val="ListParagraph"/>
+        <w:numPr>
+          <w:ilvl w:val="1"/>
+          <w:numId w:val="1"/>
+        </w:numPr>
+        <w:rPr>
+          <w:rFonts w:ascii="Garamond" w:hAnsi="Garamond"/>
+        </w:rPr>
+      </w:pPr>
+      <w:r>
+        <w:rPr>
+          <w:rFonts w:ascii="Garamond" w:hAnsi="Garamond"/>
+        </w:rPr>
+        <w:t>There was a good mixture of working individually and in groups: ___</w:t>
+      </w:r>
+    </w:p>
+    <w:p>
+      <w:pPr>
+        <w:rPr>
+          <w:rFonts w:ascii="Garamond" w:hAnsi="Garamond"/>
+        </w:rPr>
+      </w:pPr>
+    </w:p>
+    <w:p>
+      <w:pPr>
+        <w:pStyle w:val="ListParagraph"/>
+        <w:numPr>
+          <w:ilvl w:val="1"/>
+          <w:numId w:val="1"/>
+        </w:numPr>
+        <w:rPr>
+          <w:rFonts w:ascii="Garamond" w:hAnsi="Garamond"/>
+        </w:rPr>
+      </w:pPr>
+      <w:r>
+        <w:rPr>
+          <w:rFonts w:ascii="Garamond" w:hAnsi="Garamond"/>
+        </w:rPr>
+        <w:t>The pace of the class was appropriate (not too fast or too slow): ___</w:t>
+      </w:r>
     </w:p>
     <w:p>
       <w:pPr>
@@ -936,361 +1325,6 @@
         <w:rPr>
           <w:rFonts w:ascii="Garamond" w:hAnsi="Garamond"/>
         </w:rPr>
-        <w:t xml:space="preserve">How does the workload </w:t>
-      </w:r>
-      <w:r>
-        <w:rPr>
-          <w:rFonts w:ascii="Garamond" w:hAnsi="Garamond"/>
-        </w:rPr>
-        <w:t xml:space="preserve">for this class </w:t>
-      </w:r>
-      <w:r>
-        <w:rPr>
-          <w:rFonts w:ascii="Garamond" w:hAnsi="Garamond"/>
-        </w:rPr>
-        <w:t>compare to other classes?</w:t>
-      </w:r>
-    </w:p>
-    <w:p>
-      <w:pPr>
-        <w:rPr>
-          <w:rFonts w:ascii="Garamond" w:hAnsi="Garamond"/>
-        </w:rPr>
-      </w:pPr>
-    </w:p>
-    <w:p>
-      <w:pPr>
-        <w:rPr>
-          <w:rFonts w:ascii="Garamond" w:hAnsi="Garamond"/>
-        </w:rPr>
-      </w:pPr>
-    </w:p>
-    <w:p>
-      <w:pPr>
-        <w:rPr>
-          <w:rFonts w:ascii="Garamond" w:hAnsi="Garamond"/>
-        </w:rPr>
-      </w:pPr>
-    </w:p>
-    <w:p>
-      <w:pPr>
-        <w:rPr>
-          <w:rFonts w:ascii="Garamond" w:hAnsi="Garamond"/>
-        </w:rPr>
-      </w:pPr>
-    </w:p>
-    <w:p>
-      <w:pPr>
-        <w:rPr>
-          <w:rFonts w:ascii="Garamond" w:hAnsi="Garamond"/>
-        </w:rPr>
-      </w:pPr>
-    </w:p>
-    <w:p>
-      <w:pPr>
-        <w:rPr>
-          <w:rFonts w:ascii="Garamond" w:hAnsi="Garamond"/>
-        </w:rPr>
-      </w:pPr>
-    </w:p>
-    <w:p>
-      <w:pPr>
-        <w:pStyle w:val="ListParagraph"/>
-        <w:numPr>
-          <w:ilvl w:val="0"/>
-          <w:numId w:val="1"/>
-        </w:numPr>
-        <w:rPr>
-          <w:rFonts w:ascii="Garamond" w:hAnsi="Garamond"/>
-        </w:rPr>
-      </w:pPr>
-      <w:r>
-        <w:rPr>
-          <w:rFonts w:ascii="Garamond" w:hAnsi="Garamond"/>
-        </w:rPr>
-        <w:t>Rate the following statements on a scale of 1 (strongly disagree) - 10 (strongly agree):</w:t>
-      </w:r>
-    </w:p>
-    <w:p>
-      <w:pPr>
-        <w:ind w:left="360"/>
-        <w:rPr>
-          <w:rFonts w:ascii="Garamond" w:hAnsi="Garamond"/>
-        </w:rPr>
-      </w:pPr>
-    </w:p>
-    <w:p>
-      <w:pPr>
-        <w:pStyle w:val="ListParagraph"/>
-        <w:numPr>
-          <w:ilvl w:val="1"/>
-          <w:numId w:val="1"/>
-        </w:numPr>
-        <w:rPr>
-          <w:rFonts w:ascii="Garamond" w:hAnsi="Garamond"/>
-        </w:rPr>
-      </w:pPr>
-      <w:r>
-        <w:rPr>
-          <w:rFonts w:ascii="Garamond" w:hAnsi="Garamond"/>
-        </w:rPr>
-        <w:t>My teacher was prepared for class: ___</w:t>
-      </w:r>
-    </w:p>
-    <w:p>
-      <w:pPr>
-        <w:pStyle w:val="ListParagraph"/>
-        <w:rPr>
-          <w:rFonts w:ascii="Garamond" w:hAnsi="Garamond"/>
-        </w:rPr>
-      </w:pPr>
-    </w:p>
-    <w:p>
-      <w:pPr>
-        <w:pStyle w:val="ListParagraph"/>
-        <w:numPr>
-          <w:ilvl w:val="1"/>
-          <w:numId w:val="1"/>
-        </w:numPr>
-        <w:rPr>
-          <w:rFonts w:ascii="Garamond" w:hAnsi="Garamond"/>
-        </w:rPr>
-      </w:pPr>
-      <w:r>
-        <w:rPr>
-          <w:rFonts w:ascii="Garamond" w:hAnsi="Garamond"/>
-        </w:rPr>
-        <w:t xml:space="preserve">The </w:t>
-      </w:r>
-      <w:r>
-        <w:rPr>
-          <w:rFonts w:ascii="Garamond" w:hAnsi="Garamond"/>
-        </w:rPr>
-        <w:t>in-class activities and worksheets</w:t>
-      </w:r>
-      <w:r>
-        <w:rPr>
-          <w:rFonts w:ascii="Garamond" w:hAnsi="Garamond"/>
-        </w:rPr>
-        <w:t xml:space="preserve"> helped me understand the material: ___</w:t>
-      </w:r>
-    </w:p>
-    <w:p>
-      <w:pPr>
-        <w:rPr>
-          <w:rFonts w:ascii="Garamond" w:hAnsi="Garamond"/>
-        </w:rPr>
-      </w:pPr>
-    </w:p>
-    <w:p>
-      <w:pPr>
-        <w:pStyle w:val="ListParagraph"/>
-        <w:numPr>
-          <w:ilvl w:val="1"/>
-          <w:numId w:val="1"/>
-        </w:numPr>
-        <w:rPr>
-          <w:rFonts w:ascii="Garamond" w:hAnsi="Garamond"/>
-        </w:rPr>
-      </w:pPr>
-      <w:r>
-        <w:rPr>
-          <w:rFonts w:ascii="Garamond" w:hAnsi="Garamond"/>
-        </w:rPr>
-        <w:t xml:space="preserve">The </w:t>
-      </w:r>
-      <w:r>
-        <w:rPr>
-          <w:rFonts w:ascii="Garamond" w:hAnsi="Garamond"/>
-        </w:rPr>
-        <w:t>in-class activities</w:t>
-      </w:r>
-      <w:r>
-        <w:rPr>
-          <w:rFonts w:ascii="Garamond" w:hAnsi="Garamond"/>
-        </w:rPr>
-        <w:t xml:space="preserve"> </w:t>
-      </w:r>
-      <w:r>
-        <w:rPr>
-          <w:rFonts w:ascii="Garamond" w:hAnsi="Garamond"/>
-        </w:rPr>
-        <w:t>and worksheets</w:t>
-      </w:r>
-      <w:r>
-        <w:rPr>
-          <w:rFonts w:ascii="Garamond" w:hAnsi="Garamond"/>
-        </w:rPr>
-        <w:t xml:space="preserve"> </w:t>
-      </w:r>
-      <w:r>
-        <w:rPr>
-          <w:rFonts w:ascii="Garamond" w:hAnsi="Garamond"/>
-        </w:rPr>
-        <w:t>were</w:t>
-      </w:r>
-      <w:r>
-        <w:rPr>
-          <w:rFonts w:ascii="Garamond" w:hAnsi="Garamond"/>
-        </w:rPr>
-        <w:t xml:space="preserve"> engaging and interesting: ___</w:t>
-      </w:r>
-    </w:p>
-    <w:p>
-      <w:pPr>
-        <w:rPr>
-          <w:rFonts w:ascii="Garamond" w:hAnsi="Garamond"/>
-        </w:rPr>
-      </w:pPr>
-    </w:p>
-    <w:p>
-      <w:pPr>
-        <w:pStyle w:val="ListParagraph"/>
-        <w:numPr>
-          <w:ilvl w:val="1"/>
-          <w:numId w:val="1"/>
-        </w:numPr>
-        <w:rPr>
-          <w:rFonts w:ascii="Garamond" w:hAnsi="Garamond"/>
-        </w:rPr>
-      </w:pPr>
-      <w:r>
-        <w:rPr>
-          <w:rFonts w:ascii="Garamond" w:hAnsi="Garamond"/>
-        </w:rPr>
-        <w:t>The homework helped me understand the material: ___</w:t>
-      </w:r>
-    </w:p>
-    <w:p>
-      <w:pPr>
-        <w:pStyle w:val="ListParagraph"/>
-        <w:rPr>
-          <w:rFonts w:ascii="Garamond" w:hAnsi="Garamond"/>
-        </w:rPr>
-      </w:pPr>
-    </w:p>
-    <w:p>
-      <w:pPr>
-        <w:pStyle w:val="ListParagraph"/>
-        <w:numPr>
-          <w:ilvl w:val="1"/>
-          <w:numId w:val="1"/>
-        </w:numPr>
-        <w:rPr>
-          <w:rFonts w:ascii="Garamond" w:hAnsi="Garamond"/>
-        </w:rPr>
-      </w:pPr>
-      <w:r>
-        <w:rPr>
-          <w:rFonts w:ascii="Garamond" w:hAnsi="Garamond"/>
-        </w:rPr>
-        <w:t>The teacher provided helpful feedback on my work: ___</w:t>
-      </w:r>
-    </w:p>
-    <w:p>
-      <w:pPr>
-        <w:rPr>
-          <w:rFonts w:ascii="Garamond" w:hAnsi="Garamond"/>
-        </w:rPr>
-      </w:pPr>
-    </w:p>
-    <w:p>
-      <w:pPr>
-        <w:pStyle w:val="ListParagraph"/>
-        <w:numPr>
-          <w:ilvl w:val="1"/>
-          <w:numId w:val="1"/>
-        </w:numPr>
-        <w:rPr>
-          <w:rFonts w:ascii="Garamond" w:hAnsi="Garamond"/>
-        </w:rPr>
-      </w:pPr>
-      <w:r>
-        <w:rPr>
-          <w:rFonts w:ascii="Garamond" w:hAnsi="Garamond"/>
-        </w:rPr>
-        <w:t>The tests and assessments accurately captured my understanding</w:t>
-      </w:r>
-      <w:r>
-        <w:rPr>
-          <w:rFonts w:ascii="Garamond" w:hAnsi="Garamond"/>
-        </w:rPr>
-        <w:t>: ___</w:t>
-      </w:r>
-    </w:p>
-    <w:p>
-      <w:pPr>
-        <w:rPr>
-          <w:rFonts w:ascii="Garamond" w:hAnsi="Garamond"/>
-        </w:rPr>
-      </w:pPr>
-    </w:p>
-    <w:p>
-      <w:pPr>
-        <w:pStyle w:val="ListParagraph"/>
-        <w:numPr>
-          <w:ilvl w:val="1"/>
-          <w:numId w:val="1"/>
-        </w:numPr>
-        <w:rPr>
-          <w:rFonts w:ascii="Garamond" w:hAnsi="Garamond"/>
-        </w:rPr>
-      </w:pPr>
-      <w:r>
-        <w:rPr>
-          <w:rFonts w:ascii="Garamond" w:hAnsi="Garamond"/>
-        </w:rPr>
-        <w:t>There was a good mixture of working individually and in groups: ___</w:t>
-      </w:r>
-    </w:p>
-    <w:p>
-      <w:pPr>
-        <w:rPr>
-          <w:rFonts w:ascii="Garamond" w:hAnsi="Garamond"/>
-        </w:rPr>
-      </w:pPr>
-    </w:p>
-    <w:p>
-      <w:pPr>
-        <w:pStyle w:val="ListParagraph"/>
-        <w:numPr>
-          <w:ilvl w:val="1"/>
-          <w:numId w:val="1"/>
-        </w:numPr>
-        <w:rPr>
-          <w:rFonts w:ascii="Garamond" w:hAnsi="Garamond"/>
-        </w:rPr>
-      </w:pPr>
-      <w:r>
-        <w:rPr>
-          <w:rFonts w:ascii="Garamond" w:hAnsi="Garamond"/>
-        </w:rPr>
-        <w:t>The pace of the class was appropriate (not too fast or too slow): ___</w:t>
-      </w:r>
-    </w:p>
-    <w:p>
-      <w:pPr>
-        <w:rPr>
-          <w:rFonts w:ascii="Garamond" w:hAnsi="Garamond"/>
-        </w:rPr>
-      </w:pPr>
-    </w:p>
-    <w:p>
-      <w:pPr>
-        <w:pStyle w:val="ListParagraph"/>
-        <w:numPr>
-          <w:ilvl w:val="0"/>
-          <w:numId w:val="1"/>
-        </w:numPr>
-        <w:rPr>
-          <w:rFonts w:ascii="Garamond" w:hAnsi="Garamond"/>
-        </w:rPr>
-      </w:pPr>
-      <w:r>
-        <w:rPr>
-          <w:rFonts w:ascii="Garamond" w:hAnsi="Garamond"/>
-        </w:rPr>
-        <w:lastRenderedPageBreak/>
         <w:t>Describe a specific moment this year when you felt proud of something you accomplished in CS</w:t>
       </w:r>
       <w:r>

</xml_diff>